<commit_message>
Sync Overleaf thesis with latest V23 edits
</commit_message>
<xml_diff>
--- a/source/Toprak Thesis V23.docx
+++ b/source/Toprak Thesis V23.docx
@@ -1,6 +1,6 @@
 
 <file path=word/document.xml><?xml version="1.0" encoding="utf-8"?>
-<w:document xmlns:wpc="http://schemas.microsoft.com/office/word/2010/wordprocessingCanvas" xmlns:cx="http://schemas.microsoft.com/office/drawing/2014/chartex" xmlns:cx1="http://schemas.microsoft.com/office/drawing/2015/9/8/chartex" xmlns:cx2="http://schemas.microsoft.com/office/drawing/2015/10/21/chartex" xmlns:cx3="http://schemas.microsoft.com/office/drawing/2016/5/9/chartex" xmlns:cx4="http://schemas.microsoft.com/office/drawing/2016/5/10/chartex" xmlns:cx5="http://schemas.microsoft.com/office/drawing/2016/5/11/chartex" xmlns:cx6="http://schemas.microsoft.com/office/drawing/2016/5/12/chartex" xmlns:cx7="http://schemas.microsoft.com/office/drawing/2016/5/13/chartex" xmlns:cx8="http://schemas.microsoft.com/office/drawing/2016/5/14/chartex" xmlns:mc="http://schemas.openxmlformats.org/markup-compatibility/2006" xmlns:m="http://schemas.openxmlformats.org/officeDocument/2006/math" xmlns:aink="http://schemas.microsoft.com/office/drawing/2016/ink" xmlns:am3d="http://schemas.microsoft.com/office/drawing/2017/model3d" xmlns:oel="http://schemas.microsoft.com/office/2019/extlst" xmlns:r="http://schemas.openxmlformats.org/officeDocument/2006/relationships" xmlns:wp14="http://schemas.microsoft.com/office/word/2010/wordprocessingDrawing" xmlns:wp="http://schemas.openxmlformats.org/drawingml/2006/wordprocessingDrawing" xmlns:wpg="http://schemas.microsoft.com/office/word/2010/wordprocessingGroup" xmlns:wpi="http://schemas.microsoft.com/office/word/2010/wordprocessingInk" xmlns:wps="http://schemas.microsoft.com/office/word/2010/wordprocessingShape" xmlns:o="urn:schemas-microsoft-com:office:office" xmlns:v="urn:schemas-microsoft-com:vml" xmlns:w10="urn:schemas-microsoft-com:office:word" xmlns:w="http://schemas.openxmlformats.org/wordprocessingml/2006/main" xmlns:w14="http://schemas.microsoft.com/office/word/2010/wordml" xmlns:w15="http://schemas.microsoft.com/office/word/2012/wordml" xmlns:w16cex="http://schemas.microsoft.com/office/word/2018/wordml/cex" xmlns:w16cid="http://schemas.microsoft.com/office/word/2016/wordml/cid" xmlns:w16="http://schemas.microsoft.com/office/word/2018/wordml" xmlns:w16sdtdh="http://schemas.microsoft.com/office/word/2020/wordml/sdtdatahash" xmlns:w16sdtfl="http://schemas.microsoft.com/office/word/2024/wordml/sdtformatlock" xmlns:w16se="http://schemas.microsoft.com/office/word/2015/wordml/symex" xmlns:w16du="http://schemas.microsoft.com/office/word/2023/wordml/word16du" xmlns:wne="http://schemas.microsoft.com/office/word/2006/wordml" mc:Ignorable="w14 w15 w16se w16cid w16 w16cex w16sdtdh w16sdtfl w16du wp14">
+<w:document xmlns:wpc="http://schemas.microsoft.com/office/word/2010/wordprocessingCanvas" xmlns:cx="http://schemas.microsoft.com/office/drawing/2014/chartex" xmlns:cx1="http://schemas.microsoft.com/office/drawing/2015/9/8/chartex" xmlns:cx2="http://schemas.microsoft.com/office/drawing/2015/10/21/chartex" xmlns:cx3="http://schemas.microsoft.com/office/drawing/2016/5/9/chartex" xmlns:cx4="http://schemas.microsoft.com/office/drawing/2016/5/10/chartex" xmlns:cx5="http://schemas.microsoft.com/office/drawing/2016/5/11/chartex" xmlns:cx6="http://schemas.microsoft.com/office/drawing/2016/5/12/chartex" xmlns:cx7="http://schemas.microsoft.com/office/drawing/2016/5/13/chartex" xmlns:cx8="http://schemas.microsoft.com/office/drawing/2016/5/14/chartex" xmlns:mc="http://schemas.openxmlformats.org/markup-compatibility/2006" xmlns:m="http://schemas.openxmlformats.org/officeDocument/2006/math" xmlns:aink="http://schemas.microsoft.com/office/drawing/2016/ink" xmlns:am3d="http://schemas.microsoft.com/office/drawing/2017/model3d" xmlns:oel="http://schemas.microsoft.com/office/2019/extlst" xmlns:r="http://schemas.openxmlformats.org/officeDocument/2006/relationships" xmlns:wp14="http://schemas.microsoft.com/office/word/2010/wordprocessingDrawing" xmlns:wp="http://schemas.openxmlformats.org/drawingml/2006/wordprocessingDrawing" xmlns:wpg="http://schemas.microsoft.com/office/word/2010/wordprocessingGroup" xmlns:wpi="http://schemas.microsoft.com/office/word/2010/wordprocessingInk" xmlns:wps="http://schemas.microsoft.com/office/word/2010/wordprocessingShape" xmlns:o="urn:schemas-microsoft-com:office:office" xmlns:v="urn:schemas-microsoft-com:vml" xmlns:w10="urn:schemas-microsoft-com:office:word" xmlns:w="http://schemas.openxmlformats.org/wordprocessingml/2006/main" xmlns:w14="http://schemas.microsoft.com/office/word/2010/wordml" xmlns:w15="http://schemas.microsoft.com/office/word/2012/wordml" xmlns:w16cei="http://schemas.microsoft.com/office/word/2026/wordml/cei" xmlns:w16cex="http://schemas.microsoft.com/office/word/2018/wordml/cex" xmlns:w16cid="http://schemas.microsoft.com/office/word/2016/wordml/cid" xmlns:w16="http://schemas.microsoft.com/office/word/2018/wordml" xmlns:w16sdtdh="http://schemas.microsoft.com/office/word/2020/wordml/sdtdatahash" xmlns:w16sdtfl="http://schemas.microsoft.com/office/word/2024/wordml/sdtformatlock" xmlns:w16se="http://schemas.microsoft.com/office/word/2015/wordml/symex" xmlns:w16du="http://schemas.microsoft.com/office/word/2023/wordml/word16du" xmlns:wne="http://schemas.microsoft.com/office/word/2006/wordml" mc:Ignorable="w14 w15 w16se w16cid w16 w16cex w16sdtdh w16sdtfl w16du wp14">
   <w:body>
     <w:p>
       <w:r>
@@ -71,14 +71,7 @@
           <w:i/>
           <w:sz w:val="28"/>
         </w:rPr>
-        <w:t>How labor-migration policy relates to the skill composition of long-term employment-related immigration in European destinations</w:t>
-      </w:r>
-      <w:r>
-        <w:rPr>
-          <w:i/>
-          <w:sz w:val="28"/>
-        </w:rPr>
-        <w:t>?</w:t>
+        <w:t>How does labor-migration policy relate to the skill composition of long-term employment-related immigration in European destinations?</w:t>
       </w:r>
     </w:p>
     <w:p/>
@@ -138,10 +131,10 @@
       </w:r>
       <w:r>
         <w:br/>
-        <w:t>Word count: 14,9</w:t>
-      </w:r>
-      <w:r>
-        <w:t>90</w:t>
+        <w:t>Word count: 14,99</w:t>
+      </w:r>
+      <w:r>
+        <w:t>2</w:t>
       </w:r>
     </w:p>
     <w:p>
@@ -276,23 +269,7 @@
           <w:sz w:val="22"/>
           <w:szCs w:val="22"/>
         </w:rPr>
-        <w:t>The aggregate model does not show a statistically significant association. In the preferred bilateral model, a one-unit increase in lagged cumulative net restrictiveness is associated with a 0.65-percentage-point higher high-skilled permit share (β = 0.006516, p &lt; 0.001, N = 5,608; bootstrap p = 0.007). Reintroducing 2020 leaves the estimate positive and significant</w:t>
-      </w:r>
-      <w:r>
-        <w:rPr>
-          <w:rFonts w:asciiTheme="minorHAnsi" w:hAnsiTheme="minorHAnsi"/>
-          <w:sz w:val="22"/>
-          <w:szCs w:val="22"/>
-        </w:rPr>
-        <w:t xml:space="preserve">. </w:t>
-      </w:r>
-      <w:r>
-        <w:rPr>
-          <w:rFonts w:asciiTheme="minorHAnsi" w:hAnsiTheme="minorHAnsi"/>
-          <w:sz w:val="22"/>
-          <w:szCs w:val="22"/>
-        </w:rPr>
-        <w:t>PPML finds a positive high-skilled permit-count association (β = 0.045536, p = 0.002) but no significant total-count change. The work-visa-only estimate is larger (β = 0.008190, p &lt; 0.001). These are conditional associations, not causal effects of a dedicated high-skill route.</w:t>
+        <w:t>The aggregate model does not show a statistically significant association. In the preferred bilateral model, a one-unit increase in lagged cumulative net restrictiveness is associated with a 0.65-percentage-point higher high-skilled permit share (β = 0.006516, p &lt; 0.001, N = 5,608; bootstrap p = 0.007). Reintroducing 2020 leaves the estimate positive and significant. PPML finds a positive high-skilled permit-count association (β = 0.045536, p = 0.002) but no significant total-count change. The work-visa-only estimate is larger (β = 0.008190, p &lt; 0.001). The association is not statistically significant when the United Kingdom is added to the sample or when destination-specific linear trends are included. These are conditional associations, not causal effects of a dedicated high-skill route.</w:t>
       </w:r>
     </w:p>
     <w:p>
@@ -797,13 +774,7 @@
         </w:tabs>
       </w:pPr>
       <w:r>
-        <w:t>13. Appendix</w:t>
-      </w:r>
-      <w:r>
-        <w:t>:</w:t>
-      </w:r>
-      <w:r>
-        <w:t xml:space="preserve"> Extended-window PPML sensitivity</w:t>
+        <w:t>13. Appendix: Extended-window PPML sensitivity</w:t>
       </w:r>
       <w:r>
         <w:tab/>
@@ -1338,7 +1309,7 @@
           <w:sz w:val="22"/>
           <w:szCs w:val="22"/>
         </w:rPr>
-        <w:t xml:space="preserve">The measurement literature points in the same direction. Rayp, Ruyssen and Standaert (2017), Helbling et al. (2017), and de Haas, Natter and Vezzoli’s (2015) work on migration-policy change show that immigration policy is multidimensional. Visible entry rules and less visible rules on stay, rights, and integration do not necessarily move together. </w:t>
+        <w:t xml:space="preserve">The measurement literature points in the same direction. Work on migration-policy change by Rayp, Ruyssen and Standaert (2017), Helbling et al. (2017), and de Haas, Natter and Vezzoli (2015) shows that immigration policy is multidimensional. Visible entry rules and less visible rules on stay, rights, and integration do not necessarily move together. </w:t>
       </w:r>
     </w:p>
     <w:p>
@@ -1378,7 +1349,7 @@
           <w:szCs w:val="22"/>
         </w:rPr>
         <w:lastRenderedPageBreak/>
-        <w:t>entry-policy index and origin-year fixed effects. Bertoli and Fernández-Huertas Moraga (2013) show how alternative destinations create multilateral-resistance bias and propose Common Correlated Effects estimation, while Czaika and Parsons (2017) estimate a micro-founded bilateral gravity model with separate high-skilled policy instruments. Measurement-focused work, including Rayp, Ruyssen and Standaert (2017) and Helbling et al. (2017), instead builds synthetic country-level policy indices. This thesis combines an aggregate benchmark with a bilateral model; origin-year fixed effects absorb shocks common to each origin-year and therefore reduce, but do not eliminate, multilateral-resistance concerns.</w:t>
+        <w:t>entry-policy index and origin-year fixed effects. Bertoli and Fernández-Huertas Moraga (2013) show how alternative destinations create multilateral-resistance bias and propose Common Correlated Effects estimation, while Czaika and Parsons (2017) estimate a micro-founded bilateral gravity model with separate high-skilled policy instruments. Measurement-focused work, including Rayp, Ruyssen and Standaert (2017) and Helbling et al. (2017), instead builds synthetic country-level policy indices. This thesis combines an aggregate benchmark with a bilateral origin-year fixed-effects model.</w:t>
       </w:r>
     </w:p>
     <w:p>
@@ -1480,15 +1451,7 @@
           <w:rFonts w:asciiTheme="minorHAnsi" w:hAnsiTheme="minorHAnsi"/>
           <w:sz w:val="22"/>
         </w:rPr>
-        <w:t xml:space="preserve">The thesis makes five contributions. First, it links Eurostat first-residence-permit statistics to dated DEMIG-QuantMig policy events. Second, its signed, magnitude-weighted policy measure preserves the direction and size of each reform. Third, it separates all-migrant-worker reforms from reforms targeting skilled/high-skilled or low-skilled workers. Fourth, it estimates a bilateral origin-destination-year model with destination and origin-year fixed effects and denominator weights. Fifth, it uses wild-cluster bootstrap inference to address the limited number of </w:t>
-      </w:r>
-      <w:r>
-        <w:rPr>
-          <w:rFonts w:asciiTheme="minorHAnsi" w:hAnsiTheme="minorHAnsi"/>
-          <w:sz w:val="22"/>
-        </w:rPr>
-        <w:lastRenderedPageBreak/>
-        <w:t>destination clusters. These choices sharpen the analysis, but the estimates remain conditional associations rather than causal effects.</w:t>
+        <w:t>The thesis makes five contributions. First, it links Eurostat first-residence-permit statistics to dated DEMIG-QuantMig policy events. Second, its signed, magnitude-weighted policy measure preserves the direction and size of each reform. Third, it separates all-migrant-worker reforms from reforms targeting skilled/high-skilled or low-skilled workers. Fourth, it estimates a bilateral origin-destination-year model with destination and origin-year fixed effects and denominator weights. Fifth, it uses wild-cluster bootstrap inference to address the limited number of destination clusters.</w:t>
       </w:r>
     </w:p>
     <w:p>
@@ -1496,6 +1459,7 @@
         <w:pStyle w:val="Heading1"/>
       </w:pPr>
       <w:r>
+        <w:lastRenderedPageBreak/>
         <w:t>3. Theoretical Framework</w:t>
       </w:r>
     </w:p>
@@ -1623,7 +1587,7 @@
           <w:sz w:val="22"/>
           <w:szCs w:val="22"/>
         </w:rPr>
-        <w:t xml:space="preserve">A tightening of the general work-permit channel is therefore expected to affect lower-skilled workers more strongly than high-skilled workers who retain a dedicated route. This asymmetric </w:t>
+        <w:t xml:space="preserve">A tightening of the general work-permit channel is therefore expected to affect lower-skilled workers more strongly than high-skilled workers who retain a dedicated route. This asymmetric entry-channel elasticity argument differs from the standard cross-destination elasticity argument, which predicts the opposite sign: if the only outside option were another destination, high-skilled workers would leave a tightening destination faster and the high-skilled share would </w:t>
       </w:r>
       <w:r>
         <w:rPr>
@@ -1632,7 +1596,7 @@
           <w:szCs w:val="22"/>
         </w:rPr>
         <w:lastRenderedPageBreak/>
-        <w:t>entry-channel elasticity argument differs from the standard cross-destination elasticity argument, which predicts the opposite sign: if the only outside option were another destination, high-skilled workers would leave a tightening destination faster and the high-skilled share would fall. Because dedicated high-skill channels operate alongside general work-permit rules in Europe, the within-destination entry-channel interpretation is central to the thesis.</w:t>
+        <w:t>fall. Because dedicated high-skill channels operate alongside general work-permit rules in Europe, the within-destination entry-channel interpretation is central to the thesis.</w:t>
       </w:r>
     </w:p>
     <w:p>
@@ -1744,15 +1708,7 @@
           <w:sz w:val="22"/>
           <w:szCs w:val="22"/>
         </w:rPr>
-        <w:t xml:space="preserve">The second layer is the national layer. This is where most of the variation in labor-migration restrictiveness is designed. Member States retain substantial discretion over salary thresholds, language requirements, labor-market tests, shortage-list rules, points systems, employer obligations, family-reunification rights, and national high-skilled permit schemes that operate </w:t>
-      </w:r>
-      <w:r>
-        <w:rPr>
-          <w:rFonts w:asciiTheme="minorHAnsi" w:hAnsiTheme="minorHAnsi" w:cstheme="majorHAnsi"/>
-          <w:sz w:val="22"/>
-          <w:szCs w:val="22"/>
-        </w:rPr>
-        <w:t>alongside the Blue Card.</w:t>
+        <w:t>The second layer is the national layer. This is where most of the variation in labor-migration restrictiveness is designed. Member States retain substantial discretion over salary thresholds, language requirements, labor-market tests, shortage-list rules, points systems, employer obligations, family-reunification rights, and national high-skilled permit schemes that operate alongside the Blue Card.</w:t>
       </w:r>
     </w:p>
     <w:p>
@@ -1817,7 +1773,6 @@
         <w:pStyle w:val="BodyText"/>
         <w:jc w:val="both"/>
       </w:pPr>
-      <w:proofErr w:type="gramStart"/>
       <w:r>
         <w:rPr>
           <w:i/>
@@ -1829,51 +1784,26 @@
           <w:i/>
           <w:vertAlign w:val="subscript"/>
         </w:rPr>
-        <w:t>o,d</w:t>
-      </w:r>
-      <w:proofErr w:type="gramEnd"/>
+        <w:t>o,d,t</w:t>
+      </w:r>
+      <w:r>
+        <w:t xml:space="preserve">, denoted </w:t>
+      </w:r>
+      <w:r>
+        <w:rPr>
+          <w:i/>
+        </w:rPr>
+        <w:t>EMP</w:t>
+      </w:r>
       <w:r>
         <w:rPr>
           <w:i/>
           <w:vertAlign w:val="subscript"/>
         </w:rPr>
-        <w:t>,t</w:t>
-      </w:r>
-      <w:r>
-        <w:t xml:space="preserve">, denoted </w:t>
-      </w:r>
-      <w:proofErr w:type="gramStart"/>
-      <w:r>
-        <w:rPr>
-          <w:i/>
-        </w:rPr>
-        <w:t>EMP</w:t>
-      </w:r>
-      <w:r>
-        <w:rPr>
-          <w:i/>
-          <w:vertAlign w:val="subscript"/>
-        </w:rPr>
-        <w:t>o,d</w:t>
-      </w:r>
-      <w:proofErr w:type="gramEnd"/>
-      <w:r>
-        <w:rPr>
-          <w:i/>
-          <w:vertAlign w:val="subscript"/>
-        </w:rPr>
-        <w:t>,t</w:t>
-      </w:r>
-      <w:r>
-        <w:t xml:space="preserve"> in the PPML count model, is Eurostat's total number of first residence permits issued for remunerated activities in an origin-destination-year cell. In the aggregate models, these flows are summed across the retained </w:t>
-      </w:r>
-      <w:proofErr w:type="gramStart"/>
-      <w:r>
-        <w:t>Non-EU</w:t>
-      </w:r>
-      <w:proofErr w:type="gramEnd"/>
-      <w:r>
-        <w:t xml:space="preserve"> origins for each destination-year.</w:t>
+        <w:t>o,d,t</w:t>
+      </w:r>
+      <w:r>
+        <w:t xml:space="preserve"> in the PPML count model, is Eurostat's total number of first residence permits issued for remunerated activities in an origin-destination-year cell. In the aggregate models, these flows are summed across the retained Non-EU origins for each destination-year.</w:t>
       </w:r>
     </w:p>
     <w:p>
@@ -3857,7 +3787,7 @@
         <w:t xml:space="preserve">Specification 3: Preferred bilateral share model. </w:t>
       </w:r>
       <w:r>
-        <w:t>Each observation is an origin-destination-year cell, so the model is bilateral. It is denominator-weighted because cells with larger current employment-permit denominators receive more influence. HSRate is regressed on lagged Restrict, RestrictHS, RestrictLS, bilateral PermitScale, destination unemployment, and destination GDP growth, together with destination and origin-year fixed effects. The coefficient on Restrict remains the coefficient of interest. The skill-targeted controls account for reforms that can directly affect the numerator or the lower-skilled part of the denominator. PermitScale captures the corridor's size in the previous year; the weight is the current denominator used to calculate HSRate. Destination fixed effects absorb stable country differences, while origin-year fixed effects absorb shocks shared by migrants from the same origin in the same year, including origin labor-market conditions and common changes in the attractiveness of alternative destinations. They therefore reduce, rather than eliminate, multilateral-resistance concerns. This design separates general restrictiveness from skill-targeted reforms and reduces noise from small permit cells.</w:t>
+        <w:t>Each observation is an origin-destination-year cell, so the model is bilateral. It is denominator-weighted because cells with larger current employment-permit denominators receive more influence. HSRate is regressed on lagged Restrict, RestrictHS, RestrictLS, bilateral PermitScale, destination unemployment, and destination GDP growth, together with destination and origin-year fixed effects. The coefficient on Restrict remains the coefficient of interest. The skill-targeted controls account for reforms that can directly affect the numerator or the lower-skilled part of the denominator. PermitScale captures the size of the corridor (the origin-destination pair) in the previous year; the weight is the current denominator used to calculate HSRate. Destination fixed effects absorb stable country differences, while origin-year fixed effects absorb shocks shared by migrants from the same origin in the same year, including origin labor-market conditions and common changes in the attractiveness of alternative destinations. They therefore reduce, rather than eliminate, multilateral-resistance concerns. This design separates general restrictiveness from skill-targeted reforms and reduces noise from small permit cells.</w:t>
       </w:r>
     </w:p>
     <w:p>
@@ -4660,10 +4590,7 @@
         <w:jc w:val="both"/>
       </w:pPr>
       <w:r>
-        <w:t xml:space="preserve">The weight is the current number of employment-related permits in the origin-destination-year cell. Weighted least squares gives larger permit flows more influence and down-weights small cells whose calculated shares are more volatile. It therefore asks whether restrictiveness is associated with skill composition across the permits actually issued, rather than across an average corridor in which every cell counts equally. </w:t>
-      </w:r>
-      <w:r>
-        <w:t>Weighting changes each cell’s influence; it does not add another explanatory variable to Equation (3).</w:t>
+        <w:t>The weight is the current number of employment-related permits in the origin-destination-year cell. Weighted least squares gives larger permit flows more influence and down-weights small cells whose calculated shares are more volatile. It therefore asks whether restrictiveness is associated with skill composition across the permits actually issued, rather than across an average corridor in which every cell counts equally. Weighting changes each cell’s influence; it does not add another explanatory variable to Equation (3).</w:t>
       </w:r>
     </w:p>
     <w:p>
@@ -5629,16 +5556,7 @@
         <w:jc w:val="both"/>
       </w:pPr>
       <w:r>
-        <w:t xml:space="preserve">Common EU labor-migration directives create a separate identification concern. </w:t>
-      </w:r>
-      <w:r>
-        <w:t>Origin-year fixed effects absorb EU-level shocks common to sampled destinations, but not differences in whether and when EU directives apply across destinations.</w:t>
-      </w:r>
-      <w:r>
-        <w:t xml:space="preserve"> </w:t>
-      </w:r>
-      <w:r>
-        <w:t>The coefficient on the cumulative all-migrant-</w:t>
+        <w:t>Common EU labor-migration directives create a separate identification concern. Origin-year fixed effects absorb EU-level shocks common to sampled destinations, but not differences in whether and when EU directives apply across destinations. The coefficient on the cumulative all-migrant-</w:t>
       </w:r>
       <w:r>
         <w:lastRenderedPageBreak/>
@@ -5678,21 +5596,7 @@
         <w:jc w:val="both"/>
       </w:pPr>
       <w:r>
-        <w:t xml:space="preserve">The all-migrant-worker-only policy definition addresses a mechanical concern that would otherwise be present. </w:t>
-      </w:r>
-      <w:r>
-        <w:t xml:space="preserve">To avoid conflating general policy exposure with reforms that directly target </w:t>
-      </w:r>
-      <w:proofErr w:type="spellStart"/>
-      <w:r>
-        <w:t>HSRate’s</w:t>
-      </w:r>
-      <w:proofErr w:type="spellEnd"/>
-      <w:r>
-        <w:t xml:space="preserve"> numerator or the lower-skilled part of its denominator, the all-migrant-worker-only score remains the main regressor, while high- and low-skilled policy scores enter as controls</w:t>
-      </w:r>
-      <w:r>
-        <w:t>.</w:t>
+        <w:t>The all-migrant-worker-only policy definition addresses a mechanical concern that would otherwise be present. To avoid conflating general policy exposure with reforms that directly target HSRate’s numerator or the lower-skilled part of its denominator, the all-migrant-worker-only score remains the main regressor, while high- and low-skilled policy scores enter as controls.</w:t>
       </w:r>
     </w:p>
     <w:p>
@@ -5782,7 +5686,7 @@
           <w:rFonts w:asciiTheme="minorHAnsi" w:hAnsiTheme="minorHAnsi"/>
           <w:sz w:val="22"/>
         </w:rPr>
-        <w:t>The main outcome is built from the employment-related permit categories. The denominator is the broad employment-permit category, while the high-skilled numerator combines permits issued to highly skilled workers and researchers. EU Blue Card permits are not included in the main high-skilled numerator, for two reasons. First, the Blue Card is an EU-level channel with common legal foundations but uneven national implementation and participation, so it is not governed by the national policy changes that identify the models in the same way as national permit routes are. Second, the scheme only begins issuing permits in 2011-2012 and does not operate in all sample destinations, including the United Kingdom, Denmark, Ireland, and the non-EU European Economic Area (EEA) countries, so adding it would build a mechanical post-2012 break into the outcome series. Blue Card counts are instead examined separately in the permit-category diagnostic in Section 7.3, and the timing of the Blue Card and related directives is controlled for directly in the EU directive-window check.</w:t>
+        <w:t>The main outcome is built from the employment-related permit categories. The denominator is the broad employment-permit category, while the high-skilled numerator combines permits issued to highly skilled workers and researchers. EU Blue Card permits are not included in the main high-skilled numerator, mainly for reasons of timing and coverage: the scheme only begins issuing permits in 2011-2012 and does not operate in all sample destinations, including the United Kingdom, Denmark, Ireland, and the non-EU European Economic Area (EEA) countries, so adding it would build a mechanical post-2012 break into the outcome series. Researcher permits also rest on an EU directive, but that category is reported throughout the sample window, so it does not create a comparable break. Blue Card counts are instead examined separately in the permit-category diagnostic in Section 7.3, and the timing of the Blue Card and related directives is controlled for directly in the EU directive-window check.</w:t>
       </w:r>
     </w:p>
     <w:p>
@@ -5802,21 +5706,7 @@
           <w:rFonts w:asciiTheme="minorHAnsi" w:hAnsiTheme="minorHAnsi"/>
           <w:sz w:val="22"/>
         </w:rPr>
-        <w:t xml:space="preserve">Eurostat's classification is administrative rather than a harmonized classification based on occupation or educational attainment. Its </w:t>
-      </w:r>
-      <w:r>
-        <w:rPr>
-          <w:rFonts w:asciiTheme="minorHAnsi" w:hAnsiTheme="minorHAnsi"/>
-          <w:sz w:val="22"/>
-        </w:rPr>
-        <w:t>h</w:t>
-      </w:r>
-      <w:r>
-        <w:rPr>
-          <w:rFonts w:asciiTheme="minorHAnsi" w:hAnsiTheme="minorHAnsi"/>
-          <w:sz w:val="22"/>
-        </w:rPr>
-        <w:t xml:space="preserve">ighly skilled workers category (EMP_HSW) covers first permits issued to third-country nationals admitted under national programmes that facilitate the admission of highly skilled workers. Eurostat uses the EU Blue Card concepts only as guidance for this category: the indicative profile is paid employment requiring adequate and specific competence demonstrated by a higher-education qualification based on at least three years of </w:t>
+        <w:t xml:space="preserve">Eurostat's classification is administrative rather than a harmonized classification based on occupation or educational attainment. Its highly skilled workers category (EMP_HSW) covers first permits issued to third-country nationals admitted under national programmes that facilitate the admission of highly skilled workers. Eurostat uses the EU Blue Card concepts only as guidance for this category: the indicative profile is paid employment requiring adequate and specific competence demonstrated by a higher-education qualification based on at least three years of study or, where national law permits, at least five years of relevant professional experience at a </w:t>
       </w:r>
       <w:r>
         <w:rPr>
@@ -5824,7 +5714,7 @@
           <w:sz w:val="22"/>
         </w:rPr>
         <w:lastRenderedPageBreak/>
-        <w:t>study or, where national law permits, at least five years of relevant professional experience at a comparable level. The binding eligibility rules nevertheless come from each country's national programme and may differ across destinations. The Researchers category (EMP_RSE) covers third-country nationals with an appropriate higher-education qualification giving access to doctoral programmes who are selected by a research organisation to conduct a project for which that qualification is normally required. Accordingly, HSNumber = EMP_HSW + EMP_RSE measures permits issued through these two administrative admission routes; it does not classify every entrant independently by occupation, degree, or realised job after arrival (Eurostat 2019).</w:t>
+        <w:t>comparable level. The binding eligibility rules nevertheless come from each country's national programme and may differ across destinations. The Researchers category (EMP_RSE) covers third-country nationals with an appropriate higher-education qualification giving access to doctoral programmes who are selected by a research organisation to conduct a project for which that qualification is normally required. Accordingly, HSNumber = EMP_HSW + EMP_RSE measures permits issued through these two administrative admission routes; it does not classify every entrant independently by occupation, degree, or realised job after arrival (Eurostat 2019).</w:t>
       </w:r>
     </w:p>
     <w:p>
@@ -5949,11 +5839,7 @@
         <w:jc w:val="both"/>
       </w:pPr>
       <w:r>
-        <w:t xml:space="preserve">The remaining two steps translate retained events into a numerical score. Each event is converted into a signed magnitude, where direction is coded as More restrictive = +1, Less restrictive = -1, and No change = 0, and where magnitude is coded as Fine-tuning = 1, Minor = 2, Mid-level = 3, and Major = 4. Events with N/A magnitude are retained with weight 1, so that an assessable restrictiveness change is not dropped only because its size is not separately graded. Finally, the event score is the product of direction and magnitude, annual policy-flow scores are summed </w:t>
-      </w:r>
-      <w:r>
-        <w:lastRenderedPageBreak/>
-        <w:t>within each country-year, and the cumulative net policy-change score is the running country-year sum of those annual scores.</w:t>
+        <w:t>The remaining two steps translate retained events into a numerical score. Each event is converted into a signed magnitude, where direction is coded as More restrictive = +1, Less restrictive = -1, and No change = 0, and where magnitude is coded as Fine-tuning = 1, Minor = 2, Mid-level = 3, and Major = 4. Events with N/A magnitude are retained with weight 1, so that an assessable restrictiveness change is not dropped only because its size is not separately graded. Finally, the event score is the product of direction and magnitude, annual policy-flow scores are summed within each country-year, and the cumulative net policy-change score is the running country-year sum of those annual scores.</w:t>
       </w:r>
     </w:p>
     <w:p>
@@ -5961,6 +5847,7 @@
         <w:jc w:val="both"/>
       </w:pPr>
       <w:r>
+        <w:lastRenderedPageBreak/>
         <w:t xml:space="preserve">Let i index a recorded DEMIG-QuantMig event with assigned restrictiveness-direction code </w:t>
       </w:r>
       <m:oMath>
@@ -9657,7 +9544,7 @@
         <w:jc w:val="both"/>
       </w:pPr>
       <w:r>
-        <w:t>The destination-year controls are lagged unemployment from the Unemployment by sex and age dataset (Eurostat 2026e) and lagged real GDP growth from Eurostat's Gross domestic product (GDP) and main components dataset (Eurostat 2026c). GDP growth is complete in the current panel, while unemployment has 37 missing country-year values and therefore reduces the full-control aggregate sample.</w:t>
+        <w:t>The destination-year controls are lagged unemployment from the Unemployment by sex and age dataset (Eurostat 2026e) and lagged real GDP growth from Eurostat's Gross domestic product (GDP) and main components dataset (Eurostat 2026c). GDP growth is complete in the current panel, while unemployment has 37 missing country-year values and therefore reduces the full-control aggregate sample. In particular, the Eurostat unemployment series has no United Kingdom observations over the estimation window, so the United Kingdom is absent from all baseline regression samples; it appears only in the descriptive graphs and in the ILOSTAT-based checks in Section 8.</w:t>
       </w:r>
     </w:p>
     <w:p>
@@ -9674,7 +9561,7 @@
         <w:jc w:val="both"/>
       </w:pPr>
       <w:r>
-        <w:t>The baseline share regressions retain only cells with at least 30 employment-related permits in the current outcome year. This is the same current-year denominator used to calculate HSRate, not the lagged PermitScale control. A destination-year or origin-destination-year cell with fewer than 30 current employment permits is therefore excluded from the baseline share sample. This transparent minimum-cell rule limits ratios driven by only a handful of permits; denominator weighting then gives larger retained cells more influence. Because both choices use the observed denominator, Section 8 also reports a weighted sensitivity check that retains every positive-denominator corridor.</w:t>
+        <w:t>The baseline share regressions retain only cells with at least 30 employment-related permits in the current outcome year. This is the same current-year denominator used to calculate HSRate, not the lagged PermitScale control. A destination-year or origin-destination-year cell with fewer than 30 current employment permits is therefore excluded from the baseline share sample. This transparent minimum-cell rule limits ratios driven by only a handful of permits; denominator weighting then gives larger retained cells more influence. In the bilateral panel, this rule retains 5,608 of the 21,187 positive-denominator cells that would otherwise enter the estimation. Because both choices use the observed denominator, Section 8 also reports a weighted sensitivity check that retains every positive-denominator corridor.</w:t>
       </w:r>
     </w:p>
     <w:p>
@@ -14600,7 +14487,7 @@
           <w:sz w:val="18"/>
           <w:szCs w:val="18"/>
         </w:rPr>
-        <w:t>Graph 1. Descriptive relationship between cumulative net policy-change score and HSRate, 2008-2019. Graph 1A shows each destination's first-to-last endpoint change within the window; seven series lack one or both exact boundary years. The affected destinations are Belgium, Croatia, Iceland, Luxembourg, the Netherlands, Switzerland, and the United Kingdom. Graph 1B reports cumulative policy paths for the nine largest destinations by total Non-EU employment permits, with the United Kingdom marked separately because of Brexit. France and the United Kingdom both equal 0 from 2008 through 2013; contrasting line types and markers make their exact overlap visible. Graph 1A covers 31 descriptive series; the controlled regressions retain 30 destination clusters after the complete-case filter.</w:t>
+        <w:t>Graph 1. Descriptive relationship between cumulative net policy-change score and HSRate, 2008-2019. Graph 1A shows each destination's first-to-last endpoint change within the window; seven series lack one or both exact boundary years. The affected destinations are Belgium, Croatia, Iceland, Luxembourg, the Netherlands, Switzerland, and the United Kingdom. Graph 1B reports cumulative policy paths for the nine largest destinations by total Non-EU employment permits, with the United Kingdom marked separately because of Brexit. Graph 1A covers 31 descriptive series; the controlled regressions retain 30 destination clusters after the complete-case filter.</w:t>
       </w:r>
     </w:p>
     <w:p>
@@ -14608,7 +14495,7 @@
         <w:jc w:val="both"/>
       </w:pPr>
       <w:r>
-        <w:t>Graph 1 is descriptive: its endpoint slope is insignificant, with HSRate rising in 22 destinations, unchanged in three, and falling in six. Twenty of 31 policy paths move toward net liberalization, and about 62% of retained events are less restrictive. Because denominators and endpoint windows differ, the fixed-effects models provide the formal test.</w:t>
+        <w:t>Graph 1 is descriptive: its endpoint slope is insignificant, with HSRate rising in 22 destinations, unchanged in three, and falling in six. Twenty of 31 policy paths move toward net liberalization, and about 62% of retained all-migrant-worker events are less restrictive. Because denominators and endpoint windows differ, the fixed-effects models provide the formal test.</w:t>
       </w:r>
     </w:p>
     <w:p>
@@ -18764,7 +18651,7 @@
         <w:jc w:val="both"/>
       </w:pPr>
       <w:r>
-        <w:t>The preferred bilateral coefficient is β = 0.006516 with cluster-robust SE = 0.001612 (t = 4.04, p &lt; 0.001, N = 5,608 origin-destination-year cells across G = 30 destinations). The wild-cluster bootstrap p-value is 0.007, so the result remains significant after the few-cluster correction. A one-unit increase in lagged cumulative net policy change for all-migrant-worker reforms is associated with a 0.65-percentage-point increase in HSRate, conditional on the full set of fixed effects and controls listed in the Table 7 notes. The high-skilled policy control is imprecisely estimated (β = 0.001423, p = 0.446). The low-skilled policy control is negative and marginal at ten percent (β = -0.008571, p = 0.085), so it is not treated as main evidence.</w:t>
+        <w:t>The preferred bilateral coefficient is β = 0.006516 with cluster-robust SE = 0.001612 (t = 4.04, p &lt; 0.001, N = 5,608 origin-destination-year cells across G = 30 destinations). The wild-cluster bootstrap p-value is 0.007, so the result remains significant after the few-cluster correction. A one-unit increase in lagged cumulative net policy change for all-migrant-worker reforms is associated with a 0.65-percentage-point increase in HSRate, conditional on the full set of fixed effects and controls listed in the Table 7 notes. Because about 62 percent of retained all-migrant-worker events are liberalizing and the mean cumulative score is negative, this association is identified largely from differences in liberalization, not only from outright tightening episodes. The high-skilled policy control is imprecisely estimated (β = 0.001423, p = 0.446). The low-skilled policy control is negative and marginal at ten percent (β = -0.008571, p = 0.085), so it is not treated as main evidence.</w:t>
       </w:r>
     </w:p>
     <w:p>
@@ -18772,11 +18659,8 @@
         <w:jc w:val="both"/>
       </w:pPr>
       <w:r>
-        <w:t xml:space="preserve">Scaling the estimate by event magnitude makes its size easier to interpret. A Mid-level restrictive reform contributes three cumulative units, corresponding to a 1.95-percentage-point higher </w:t>
-      </w:r>
-      <w:r>
         <w:lastRenderedPageBreak/>
-        <w:t>HSRate the following year. A Major reform contributes four units, corresponding to 2.61 percentage points. Relative to the bilateral-sample mean HSRate of 21.0 percent, the Major-reform calculation is about 12.4 percent of the mean. The comparable full-control aggregate coefficient is smaller and imprecise (β = 0.002296, p = 0.243); its four-unit calculation is about 0.92 percentage points and is not statistically distinguishable from zero.</w:t>
+        <w:t>Scaling the estimate by event magnitude makes its size easier to interpret. A Mid-level restrictive reform contributes three cumulative units, corresponding to a 1.95-percentage-point higher HSRate the following year. A Major reform contributes four units, corresponding to 2.61 percentage points. Relative to the bilateral-sample mean HSRate of 21.0 percent, the Major-reform calculation is about 12.4 percent of the mean. The comparable full-control aggregate coefficient is smaller and imprecise (β = 0.002296, p = 0.243); its four-unit calculation is about 0.92 percentage points and is not statistically distinguishable from zero.</w:t>
       </w:r>
     </w:p>
     <w:p>
@@ -20049,7 +19933,15 @@
           <w:sz w:val="18"/>
           <w:szCs w:val="18"/>
         </w:rPr>
-        <w:t>Table 8 note. *** p &lt; 0.01, ** p &lt; 0.05, * p &lt; 0.10. Poisson Pseudo-Maximum-Likelihood estimates corresponding to Equation (4), estimated on the corridors retained by the main EMP &gt;= 30 share-sample rule. The dependent variable is HSNumber in column (1) and the total employment-permit count, EMP, in column (2). Both models include lagged destination unemployment and GDP growth. For column (1), separated destination and origin-year fixed-effect groups with all-zero high-skilled counts are removed before estimation; this reduces the sample from 5,608 cells and 30 clusters to 5,219 cells and 27 clusters. Standard errors clustered by destination are reported in parentheses. Coefficients are semi-elasticities; the exact percentage change associated with one Restrict unit is 100[exp(β)-1].</w:t>
+        <w:t xml:space="preserve">Table 8 note. *** p &lt; 0.01, ** p &lt; 0.05, * p &lt; 0.10. Poisson Pseudo-Maximum-Likelihood estimates corresponding to Equation (4), estimated on the corridors retained by the main EMP &gt;= 30 share-sample rule. The dependent variable is HSNumber in column (1) and the total employment-permit count, EMP, in column (2). Both models include lagged destination unemployment and GDP growth. For column (1), separated destination and origin-year fixed-effect groups with all-zero high-skilled counts are removed before estimation; this reduces the sample from 5,608 cells and </w:t>
+      </w:r>
+      <w:r>
+        <w:rPr>
+          <w:sz w:val="18"/>
+          <w:szCs w:val="18"/>
+        </w:rPr>
+        <w:lastRenderedPageBreak/>
+        <w:t>30 clusters to 5,219 cells and 27 clusters. Standard errors clustered by destination are reported in parentheses. Coefficients are semi-elasticities; the exact percentage change associated with one Restrict unit is 100[exp(β)-1].</w:t>
       </w:r>
     </w:p>
     <w:p>
@@ -20057,7 +19949,6 @@
         <w:jc w:val="both"/>
       </w:pPr>
       <w:r>
-        <w:lastRenderedPageBreak/>
         <w:t>Table 8 complements the positive HSRate result by comparing measured high-skilled and total employment-permit counts.</w:t>
       </w:r>
     </w:p>
@@ -20076,7 +19967,7 @@
         <w:jc w:val="both"/>
       </w:pPr>
       <w:r>
-        <w:t>The positive HSNumber estimate in Table 8 should not be interpreted as evidence that general restrictions attract additional skilled migrants. HSNumber counts first permits recorded under the administrative highly-skilled-worker and researcher categories rather than entrants' underlying skills. One possible explanation is that, when the general work-permit channel tightens, some recruitment shifts toward dedicated high-skilled permit categories, which would raise the measured HSNumber without any increase in total skilled arrivals. Because the data do not follow individuals across routes, this possibility cannot be tested directly. Table 9 examines whether the positive HSNumber association is concentrated in one recorded permit category or appears across several categories. It re-estimates Equation (4) four times, changing the dependent variable in turn to highly skilled worker permits, researcher permits, EU Blue Card permits, and the residual employment-permit count (EMP − HSNumber), while retaining the policy regressor, controls, and fixed-effects structure. These are four separate PPML regressions, not four coefficients from one model.</w:t>
+        <w:t>The positive HSNumber estimate in Table 8 should not be interpreted as evidence that general restrictions attract additional skilled migrants. As Section 6.1 explains, HSNumber records administrative admission routes, not entrants' underlying skills. One possible explanation is that, when the general work-permit channel tightens, some recruitment shifts toward dedicated high-skilled permit categories, which would raise the measured HSNumber without any increase in total skilled arrivals. Because the data do not follow individuals across routes, this possibility cannot be tested directly. Table 9 examines whether the positive HSNumber association is concentrated in one recorded permit category or appears across several categories. It re-estimates Equation (4) four times, changing the dependent variable in turn to highly skilled worker permits, researcher permits, EU Blue Card permits, and the residual employment-permit count (EMP − HSNumber), while retaining the policy regressor, controls, and fixed-effects structure. These are four separate PPML regressions, not four coefficients from one model.</w:t>
       </w:r>
     </w:p>
     <w:p>
@@ -20944,7 +20835,7 @@
           <w:sz w:val="18"/>
           <w:szCs w:val="18"/>
         </w:rPr>
-        <w:t xml:space="preserve">Table 9 note. *** p &lt; 0.01, ** p &lt; 0.05, * p &lt; 0.10. Equation (4) is estimated independently four times. Each row reports one complete PPML regression using the listed permit count as its dependent variable. Across the four regressions, the policy regressor, fixed effects, controls, and destination-clustered standard-error method are held constant. The regressions determine whether the positive HSNumber association is concentrated in one administrative permit route. PPML drops fixed-effect groups whose selected outcome is always zero, so N and G differ. The outcomes are not a mutually exclusive partition: HSNumber excludes Blue Cards, so Blue Cards remain in residual EMP − </w:t>
+        <w:t xml:space="preserve">Table 9 note. *** p &lt; 0.01, ** p &lt; 0.05, * p &lt; 0.10. Equation (4) is estimated independently four times. Each row reports one complete PPML regression using the listed permit count as its dependent variable. Across the four regressions, the policy regressor, fixed effects, controls, and destination-clustered standard-error method are held constant. The regressions determine whether the positive HSNumber association is concentrated in one administrative permit route. PPML drops fixed-effect groups whose selected outcome is always zero, so N and G differ. The outcomes are </w:t>
       </w:r>
       <w:r>
         <w:rPr>
@@ -20953,7 +20844,7 @@
           <w:szCs w:val="18"/>
         </w:rPr>
         <w:lastRenderedPageBreak/>
-        <w:t>HSNumber while also being tested separately. The coefficients therefore cannot be combined as a formal decomposition.</w:t>
+        <w:t>not a mutually exclusive partition: HSNumber excludes Blue Cards, so Blue Cards remain in residual EMP − HSNumber while also being tested separately. The coefficients therefore cannot be combined as a formal decomposition.</w:t>
       </w:r>
     </w:p>
     <w:p>
@@ -20962,23 +20853,7 @@
         <w:jc w:val="both"/>
       </w:pPr>
       <w:r>
-        <w:t xml:space="preserve">Although EU Blue Card permits are excluded from the main </w:t>
-      </w:r>
-      <w:proofErr w:type="spellStart"/>
-      <w:r>
-        <w:t>HSNumber</w:t>
-      </w:r>
-      <w:proofErr w:type="spellEnd"/>
-      <w:r>
-        <w:t xml:space="preserve"> and </w:t>
-      </w:r>
-      <w:proofErr w:type="spellStart"/>
-      <w:r>
-        <w:t>HSRate</w:t>
-      </w:r>
-      <w:proofErr w:type="spellEnd"/>
-      <w:r>
-        <w:t xml:space="preserve"> measures, Eurostat reports them separately as EMP_BLUE in the same migration dataset. Table 9 therefore re-estimates the PPML model using the Blue Card count as an alternative dependent variable; this is a separate diagnostic and does not change the main outcome definition.</w:t>
+        <w:t>Although EU Blue Card permits are excluded from the main HSNumber and HSRate measures, Eurostat reports them separately as EMP_BLUE in the same migration dataset. Table 9 therefore re-estimates the PPML model using the Blue Card count as an alternative dependent variable; this is a separate diagnostic and does not change the main outcome definition.</w:t>
       </w:r>
     </w:p>
     <w:p>
@@ -22303,7 +22178,7 @@
                 <w:sz w:val="16"/>
                 <w:szCs w:val="16"/>
               </w:rPr>
-              <w:t>Positive and significant for H/UM/LM; low-income estimate is negative and marginal</w:t>
+              <w:t>Positive and significant for high/upper-middle/lower-middle-income origins; low-income estimate is negative and marginal</w:t>
             </w:r>
           </w:p>
         </w:tc>
@@ -22895,21 +22770,7 @@
         <w:jc w:val="both"/>
       </w:pPr>
       <w:r>
-        <w:t>R3 changes the denominator using Eurostat's all-first-permits dataset (migr_resfirst; Eurostat 2026a).</w:t>
-      </w:r>
-      <w:r>
-        <w:t xml:space="preserve"> </w:t>
-      </w:r>
-      <w:r>
-        <w:t xml:space="preserve">The numerator keeps highly skilled </w:t>
-      </w:r>
-      <w:proofErr w:type="gramStart"/>
-      <w:r>
-        <w:t>worker</w:t>
-      </w:r>
-      <w:proofErr w:type="gramEnd"/>
-      <w:r>
-        <w:t xml:space="preserve"> and researcher permits but is divided by all first residence permits in the cell, including family, education, and other reasons. The weighted coefficient remains significant (β = 0.000958, p = 0.004, N = 4,735), as do the corridor-fixed-effects variant (β = 0.000975, p = 0.031) and the version retaining the original permit-scale control (β = 0.001015, p = 0.001, N = 5,608).</w:t>
+        <w:t>R3 changes the denominator using Eurostat's all-first-permits dataset (migr_resfirst; Eurostat 2026a). The numerator keeps highly skilled worker and researcher permits but is divided by all first residence permits in the cell, including family, education, and other reasons. The weighted coefficient remains significant (β = 0.000958, p = 0.004, N = 4,735), as do the corridor-fixed-effects variant (β = 0.000975, p = 0.031) and the version retaining the original permit-scale control (β = 0.001015, p = 0.001, N = 5,608).</w:t>
       </w:r>
     </w:p>
     <w:p>
@@ -22985,7 +22846,7 @@
         <w:jc w:val="both"/>
       </w:pPr>
       <w:r>
-        <w:t>R8 divides migrant-origin countries into income groups using the World Bank’s FY2020 country income classification (World Bank Data Team 2019), such as high-income, upper-middle-income, lower-middle-income, and low-income origins. It then re-runs the preferred model separately for each group to see whether the relationship between policy restrictiveness and the high-skilled share is stronger, weaker, or absent for migrants from different income levels. The association remains significant for high-income (β = 0.016784, p = 0.003), upper-middle-income (β = 0.004139, p = 0.014), and lower-middle-income origins (β = 0.006739, p = 0.001). The low-income estimate is negative but marginal (β = -0.002422, p = 0.083, N = 347, G = 19) and is not treated as an established reversal.</w:t>
+        <w:t>R8 divides migrant-origin countries into income groups using the World Bank’s FY2020 country income classification (World Bank Data Team 2019): high-income, upper-middle-income, lower-middle-income, and low-income origins. It then re-runs the preferred model separately for each group to see whether the relationship between policy restrictiveness and the high-skilled share is stronger, weaker, or absent for migrants from different income levels. The association remains significant for high-income (β = 0.016784, p = 0.003), upper-middle-income (β = 0.004139, p = 0.014), and lower-middle-income origins (β = 0.006739, p = 0.001). The low-income estimate is negative but marginal (β = -0.002422, p = 0.083, N = 347, G = 19) and is not treated as an established reversal.</w:t>
       </w:r>
     </w:p>
     <w:p>
@@ -23003,11 +22864,7 @@
         <w:jc w:val="both"/>
       </w:pPr>
       <w:r>
-        <w:t xml:space="preserve">A single combined applicable-window indicator gives β = 0.006518 (SE = 0.001619, p &lt; 0.001); adding the four directive indicators separately gives β = 0.006587 (SE = 0.001581, p &lt; 0.001). Both are close to the preferred 0.006516, and no directive indicator is individually significant at five percent. The main result remains after controlling for broad EU directive periods, so it does not appear to be driven by those directive windows. However, these controls are only rough </w:t>
-      </w:r>
-      <w:r>
-        <w:lastRenderedPageBreak/>
-        <w:t>timing indicators and should not be interpreted as causal estimates of the effects of specific reforms. Graph 2 reports the four directive-dummy coefficients.</w:t>
+        <w:t>A single combined applicable-window indicator gives β = 0.006518 (SE = 0.001619, p &lt; 0.001); adding the four directive indicators separately gives β = 0.006587 (SE = 0.001581, p &lt; 0.001). Both are close to the preferred 0.006516, and no directive indicator is individually significant at five percent. The main result remains after controlling for broad EU directive periods, so it does not appear to be driven by those directive windows. Graph 2 reports the four directive-dummy coefficients.</w:t>
       </w:r>
     </w:p>
     <w:p>
@@ -23018,9 +22875,10 @@
         <w:rPr>
           <w:noProof/>
         </w:rPr>
+        <w:lastRenderedPageBreak/>
         <w:drawing>
           <wp:inline distT="0" distB="0" distL="0" distR="0" wp14:anchorId="47844AFD" wp14:editId="7ED3C115">
-            <wp:extent cx="6161239" cy="3061982"/>
+            <wp:extent cx="6161239" cy="2661200"/>
             <wp:effectExtent l="0" t="0" r="0" b="0"/>
             <wp:docPr id="4" name="Picture 4"/>
             <wp:cNvGraphicFramePr>
@@ -23042,7 +22900,7 @@
                   <pic:spPr>
                     <a:xfrm>
                       <a:off x="0" y="0"/>
-                      <a:ext cx="6282000" cy="3121997"/>
+                      <a:ext cx="6282000" cy="2713362"/>
                     </a:xfrm>
                     <a:prstGeom prst="rect">
                       <a:avLst/>
@@ -23087,11 +22945,11 @@
         <w:jc w:val="both"/>
       </w:pPr>
       <w:r>
-        <w:t xml:space="preserve">R12 adds destination-specific linear time trends to the preferred bilateral model, allowing each destination to follow its own smooth trajectory over 2008-2019. The coefficient stays positive but </w:t>
+        <w:t xml:space="preserve">R12 adds destination-specific linear time trends to the preferred bilateral model, allowing each destination to follow its own smooth trajectory over 2008-2019. The coefficient stays positive but becomes small and insignificant (β = 0.002488, p = 0.198). Because the cumulative policy score </w:t>
       </w:r>
       <w:r>
         <w:lastRenderedPageBreak/>
-        <w:t>becomes small and insignificant (β = 0.002488, p = 0.198). Because the cumulative policy score changes slowly by construction, these trends absorb much of its within-destination variation, and the preferred association cannot be cleanly separated from smooth destination-level trajectories.</w:t>
+        <w:t>changes slowly by construction, these trends absorb much of its within-destination variation, and the preferred association cannot be cleanly separated from smooth destination-level trajectories.</w:t>
       </w:r>
     </w:p>
     <w:p>
@@ -23116,30 +22974,7 @@
         <w:jc w:val="both"/>
       </w:pPr>
       <w:r>
-        <w:t>EU citizens are conceptually useful as a placebo population because national labor-migration rules for third-country workers should not directly govern movement under EU free-movement law. The main Eurostat residence-permit source</w:t>
-      </w:r>
-      <w:r>
-        <w:t xml:space="preserve"> </w:t>
-      </w:r>
-      <w:r>
-        <w:t xml:space="preserve">cannot implement that comparison credibly. It records first residence permits issued for remunerated activities, whereas EU citizens generally may live and work in another Member State without obtaining those permits. Its EU-citizen rows therefore capture sparse, country-specific administrative exceptions rather than a representative sample of EU-to-EU movers. A preliminary permit-based construction retained only 38 destination-year observations across 13 </w:t>
-      </w:r>
-      <w:proofErr w:type="gramStart"/>
-      <w:r>
-        <w:t>destinations</w:t>
-      </w:r>
-      <w:proofErr w:type="gramEnd"/>
-      <w:r>
-        <w:t xml:space="preserve"> and these observations are likely administrative exceptions because EU citizens do not normally need residence permits. Therefore, p</w:t>
-      </w:r>
-      <w:r>
-        <w:t xml:space="preserve">ermit-based EU27 regressions </w:t>
-      </w:r>
-      <w:r>
-        <w:t xml:space="preserve">are </w:t>
-      </w:r>
-      <w:r>
-        <w:t>not treated as placebo evidence.</w:t>
+        <w:t>EU citizens are conceptually useful as a placebo population because national labor-migration rules for third-country workers should not directly govern movement under EU free-movement law. The main Eurostat residence-permit source cannot implement that comparison credibly. It records first residence permits issued for remunerated activities, whereas EU citizens generally may live and work in another Member State without obtaining those permits. Its EU-citizen rows therefore capture sparse, country-specific administrative exceptions rather than a representative sample of EU-to-EU movers. A preliminary permit-based construction retained only 38 destination-year observations across 13 destinations and these observations are likely administrative exceptions because EU citizens do not normally need residence permits. Therefore, permit-based EU27 regressions are not treated as placebo evidence.</w:t>
       </w:r>
     </w:p>
     <w:p>
@@ -23147,13 +22982,7 @@
         <w:jc w:val="both"/>
       </w:pPr>
       <w:r>
-        <w:t>The placebo diagnostic instead uses Eurostat's education-by-citizenship stock dataset (Eurostat 2026d). It reports the percentage of EU27 citizens aged 18-64 who live outside their country of citizenship and have tertiary education</w:t>
-      </w:r>
-      <w:r>
-        <w:t xml:space="preserve">. </w:t>
-      </w:r>
-      <w:r>
-        <w:t>Because observation does not depend on obtaining a residence permit, this source covers the population relevant to intra-EU free movement and is better aligned with the conceptual placebo. The destination-year regression includes destination and year fixed effects, the lagged all-migrant-worker cumulative score, high- and low-skilled policy controls, lagged unemployment and GDP growth, and destination-clustered standard errors. The association is close to zero and not statistically significant (β = 0.015 percentage points, SE = 0.182, p = 0.934, N = 236, G = 27), so the preferred positive association is not reproduced in this less directly exposed population.</w:t>
+        <w:t>The placebo diagnostic instead uses Eurostat's education-by-citizenship stock dataset (Eurostat 2026d). It reports the percentage of EU27 citizens aged 18-64 who live outside their country of citizenship and have tertiary education. Because observation does not depend on obtaining a residence permit, this source covers the population relevant to intra-EU free movement and is better aligned with the conceptual placebo. The destination-year regression includes destination and year fixed effects, the lagged all-migrant-worker cumulative score, high- and low-skilled policy controls, lagged unemployment and GDP growth, and destination-clustered standard errors. The association is close to zero and not statistically significant (β = 0.015 percentage points, SE = 0.182, p = 0.934, N = 236, G = 27), so the preferred positive association is not reproduced in this less directly exposed population.</w:t>
       </w:r>
     </w:p>
     <w:p>
@@ -23161,11 +22990,7 @@
         <w:jc w:val="both"/>
       </w:pPr>
       <w:r>
-        <w:t xml:space="preserve">This is still a limited placebo diagnostic, not a robustness check or a clean untreated control. The source measures the education composition of the resident stock rather than annual inflows, so many observed residents may have arrived before the policy year. Its tertiary-education measure also differs from the permit-route definition of HSRate, and the available percentages do not provide destination-year population counts for denominator weighting. The aggregate </w:t>
-      </w:r>
-      <w:r>
-        <w:lastRenderedPageBreak/>
-        <w:t>destination-year design cannot reproduce the bilateral origin-year fixed effects of the preferred model.</w:t>
+        <w:t>This is still a limited placebo diagnostic, not a robustness check or a clean untreated control. The source measures the education composition of the resident stock rather than annual inflows, so many observed residents may have arrived before the policy year. Its tertiary-education measure also differs from the permit-route definition of HSRate, and the available percentages do not provide destination-year population counts for denominator weighting. The aggregate destination-year design cannot reproduce the bilateral origin-year fixed effects of the preferred model.</w:t>
       </w:r>
     </w:p>
     <w:p>
@@ -23173,6 +22998,7 @@
         <w:pStyle w:val="Heading2"/>
       </w:pPr>
       <w:r>
+        <w:lastRenderedPageBreak/>
         <w:t>8.3 Additional Model Diagnostics</w:t>
       </w:r>
     </w:p>
@@ -23192,7 +23018,7 @@
         <w:rPr>
           <w:b/>
         </w:rPr>
-        <w:t>Policy-direction diagnostic. This exploratory check replaces the net cumulative Restrict score with separate cumulative totals for restrictive and liberalizing events, both of which enter the regression simultaneously. It uses the same bilateral sample, controls, and fixed effects as Equation (3), but does not apply denominator weights. Each retained corridor-year therefore receives equal weight, so large permit corridors do not automatically receive greater influence solely because of their permit volume. The liberalizing total has a negative and statistically significant coefficient (β = −0.006893, p = 0.005), while the restrictive total is imprecisely estimated (β = −0.002237, p = 0.551). The significant negative liberalizing coefficient therefore shows that the clearer association in this specification appears on the easing side. Conditional on the same controls and fixed effects, greater cumulative liberalization is associated with a lower high-skilled share, which is consistent with the main positive Restrict coefficient when read from the easing side. Liberalizing events account for about 62 percent of retained policy events. This imbalance may contribute to the greater precision of the liberalizing estimate. The diagnostic identifies the side of the net score carrying the clearer association; it does not establish a causal mechanism.</w:t>
+        <w:t>Policy-direction diagnostic. This exploratory check replaces the net cumulative Restrict score with separate cumulative totals for restrictive and liberalizing events, both of which enter the regression simultaneously. It uses the same bilateral sample, controls, and fixed effects as Equation (3), but does not apply denominator weights. Each retained corridor-year therefore receives equal weight, so large permit corridors do not automatically receive greater influence solely because of their permit volume. The liberalizing total has a negative and statistically significant coefficient (β = −0.006893, p = 0.005), while the restrictive total is imprecisely estimated (β = −0.002237, p = 0.551). The significant negative liberalizing coefficient therefore shows that the clearer association in this specification appears on the easing side. Conditional on the same controls and fixed effects, greater cumulative liberalization is associated with a lower high-skilled share, which is consistent with the main positive Restrict coefficient when read from the easing side. Liberalizing events account for about 62 percent of retained policy events. This imbalance may contribute to the greater precision of the liberalizing estimate. The diagnostic identifies the side of the net score carrying the clearer association.</w:t>
       </w:r>
     </w:p>
     <w:p>
@@ -23220,11 +23046,11 @@
         <w:t>Multicollinearity diagnostic construction.</w:t>
       </w:r>
       <w:r>
-        <w:t xml:space="preserve"> The preferred model contains six substantive regressors: the cumulative all-migrant-worker, high-skilled, and low-skilled policy scores, lagged bilateral permit scale, lagged destination unemployment, and lagged destination GDP growth. A conventional variance inflation factor (VIF) that includes hundreds of fixed-effect indicators </w:t>
+        <w:t xml:space="preserve"> The preferred model contains six substantive regressors: the cumulative all-migrant-worker, high-skilled, and low-skilled policy scores, lagged bilateral permit scale, lagged destination unemployment, and lagged destination GDP growth. A conventional variance inflation factor (VIF) that includes hundreds of fixed-effect indicators would mix intended fixed-effect absorption with collinearity among these regressors. The diagnostic therefore uses the exact preferred sample (N = 5,608) and the same current employment-permit-denominator weights. Each regressor is first residualized on destination and </w:t>
       </w:r>
       <w:r>
         <w:lastRenderedPageBreak/>
-        <w:t>would mix intended fixed-effect absorption with collinearity among these regressors. The diagnostic therefore uses the exact preferred sample (N = 5,608) and the same current employment-permit-denominator weights. Each regressor is first residualized on destination and origin-year fixed effects. Each weighted, residualized regressor is then regressed on the other five, and its VIF is calculated as one divided by one minus the auxiliary R-squared. The normalized weighted residualized design is also used to calculate pairwise correlations and the condition index.</w:t>
+        <w:t>origin-year fixed effects. Each weighted, residualized regressor is then regressed on the other five, and its VIF is calculated as one divided by one minus the auxiliary R-squared. The normalized weighted residualized design is also used to calculate pairwise correlations and the condition index.</w:t>
       </w:r>
     </w:p>
     <w:p>
@@ -23238,7 +23064,7 @@
         <w:t>Diagnostic results.</w:t>
       </w:r>
       <w:r>
-        <w:t xml:space="preserve"> The fixed-effect-adjusted weighted VIFs range from 1.049 to 1.182; the VIFs for the focal all-migrant-worker score and the high- and low-skilled policy controls are 1.109, 1.140, and 1.182, respectively. The maximum absolute within-fixed-effect weighted correlation is 0.238, and the condition index is 1.581. These values provide no indication of problematic linear redundancy among the substantive regressors. Substantively, the all-migrant-worker score is therefore not a near-linear duplicate of the high- and low-skilled policy controls after the fixed effects are removed. This diagnostic concerns coefficient precision and numerical redundancy; it does not resolve policy endogeneity or establish causality.</w:t>
+        <w:t xml:space="preserve"> The fixed-effect-adjusted weighted VIFs range from 1.049 to 1.182; the VIFs for the focal all-migrant-worker score and the high- and low-skilled policy controls are 1.109, 1.140, and 1.182, respectively. The maximum absolute within-fixed-effect weighted correlation is 0.238, and the condition index is 1.581. These values provide no indication of problematic linear redundancy among the substantive regressors. Substantively, the all-migrant-worker score is therefore not a near-linear duplicate of the high- and low-skilled policy controls after the fixed effects are removed. This diagnostic concerns coefficient precision and numerical redundancy.</w:t>
       </w:r>
     </w:p>
     <w:p>
@@ -23296,7 +23122,7 @@
         </w:rPr>
         <w:drawing>
           <wp:inline distT="0" distB="0" distL="0" distR="0" wp14:anchorId="7080212A" wp14:editId="751E4D46">
-            <wp:extent cx="5658808" cy="4509247"/>
+            <wp:extent cx="5658808" cy="4164313"/>
             <wp:effectExtent l="0" t="0" r="5715" b="0"/>
             <wp:docPr id="3" name="Graph 3 coefficient plot" descr="Coefficient estimates with 95 percent confidence intervals across aggregate, preferred, and robustness specifications."/>
             <wp:cNvGraphicFramePr>
@@ -23321,7 +23147,7 @@
                   <pic:spPr bwMode="auto">
                     <a:xfrm>
                       <a:off x="0" y="0"/>
-                      <a:ext cx="5939976" cy="4733297"/>
+                      <a:ext cx="5939976" cy="4371224"/>
                     </a:xfrm>
                     <a:prstGeom prst="rect">
                       <a:avLst/>
@@ -23365,7 +23191,7 @@
         <w:jc w:val="both"/>
       </w:pPr>
       <w:r>
-        <w:t>Graph 3 reinforces the tables: evidence is strongest in the controlled bilateral specifications. The aggregate estimates and the UK-inclusive ILOSTAT check are not significant. R1, R2, R3, R4, R6, R7, the high-income-origin point from R8, R9, and R10 remain statistically significant; R5 and the destination-specific-trend check in R12 are not significant</w:t>
+        <w:t>Graph 3 reinforces the tables: evidence is strongest in the controlled bilateral specifications. The aggregate estimates and the UK-inclusive ILOSTAT check are not significant. R1, R2, R3, R4, R6, R7, the high-income-origin point from R8, R9, and R10 remain statistically significant; R5 and the destination-specific-trend check in R12 are not significant.</w:t>
       </w:r>
     </w:p>
     <w:p>
@@ -23380,7 +23206,7 @@
         <w:lastRenderedPageBreak/>
         <w:drawing>
           <wp:inline distT="0" distB="0" distL="0" distR="0" wp14:anchorId="2CB8FCF9" wp14:editId="344FB204">
-            <wp:extent cx="5731510" cy="3267961"/>
+            <wp:extent cx="5731510" cy="3104752"/>
             <wp:effectExtent l="0" t="0" r="0" b="0"/>
             <wp:docPr id="5" name="Picture 5"/>
             <wp:cNvGraphicFramePr>
@@ -23403,7 +23229,7 @@
                   <pic:spPr bwMode="auto">
                     <a:xfrm>
                       <a:off x="0" y="0"/>
-                      <a:ext cx="5731510" cy="3267961"/>
+                      <a:ext cx="5731510" cy="3104752"/>
                     </a:xfrm>
                     <a:prstGeom prst="rect">
                       <a:avLst/>
@@ -23505,7 +23331,7 @@
         </w:rPr>
       </w:pPr>
       <w:r>
-        <w:t>Results vary across empirical designs. The coefficient remains positive in the unweighted and corridor-fixed-effects comparisons and in several Section 8 checks. However, the aggregate cumulative and annual-flow models, the UK-inclusive model, and the destination-trend model are not significant, while the unweighted bilateral result weakens under wild-cluster bootstrap inference. The finding is therefore conditional on the preferred bilateral, denominator-weighted design. Because the models differ in estimand and sometimes sample, their contrast cannot be attributed solely to origin-year fixed effects or weighting. The slowly changing cumulative score is also difficult to separate from smooth destination trajectories once linear trends are included.</w:t>
+        <w:t>Results vary across empirical designs. The coefficient remains positive in the unweighted and corridor-fixed-effects comparisons and in several Section 8 checks. However, the aggregate cumulative and annual-flow models, the UK-inclusive model, and the destination-trend model are not significant, while the unweighted bilateral result weakens under wild-cluster bootstrap inference. The finding is therefore conditional on the preferred bilateral, denominator-weighted design. Because the models differ in what they estimate and sometimes in sample, their contrast cannot be attributed solely to origin-year fixed effects or weighting. The slowly changing cumulative score is also difficult to separate from smooth destination trajectories once linear trends are included.</w:t>
       </w:r>
     </w:p>
     <w:p>
@@ -23522,7 +23348,7 @@
         </w:rPr>
       </w:pPr>
       <w:r>
-        <w:t>PPML finds a positive association with measured HSNumber but no statistically detectable association with the total employment-permit count. Outcome-specific removal of all-zero fixed-effect groups leaves different effective samples, so the count coefficients complement rather than decompose HSRate. HSNumber records the highly-skilled-worker and researcher permit categories, not entrants' underlying skills. The results therefore do not establish that low-skilled permits fell, that workers changed permit routes, or that tighter policy increased the total supply of skilled labor. The design also does not estimate welfare effects, government decision processes, or individual-level responses.</w:t>
+        <w:t>PPML finds a positive association with measured HSNumber but no statistically detectable association with the total employment-permit count. Outcome-specific removal of all-zero fixed-effect groups leaves different effective samples, so the count coefficients complement rather than decompose HSRate. The results do not establish that low-skilled permits fell, that workers changed permit routes, or that tighter policy increased the total supply of skilled labor. The design also does not estimate welfare effects, government decision processes, or individual-level responses.</w:t>
       </w:r>
     </w:p>
     <w:p>
@@ -23539,7 +23365,7 @@
         </w:rPr>
       </w:pPr>
       <w:r>
-        <w:t>Weighting and sample selection define the estimand. Denominator weighting gives larger corridors more influence and estimates composition across the permits issued rather than an equal-corridor association. The stable prior-year-weight estimate reduces concern about using a potentially policy-responsive current denominator but does not make the weight exogenous. The significant weighted no-cutoff result indicates that the 30-permit minimum does not create the finding; the weaker unweighted no-cutoff result confirms that weighting still matters.</w:t>
+        <w:t>Weighting and sample selection define what the coefficient measures. Denominator weighting gives larger corridors more influence and estimates composition across the permits issued rather than an equal-corridor association. The stable prior-year-weight estimate reduces concern about using a potentially policy-responsive current denominator but does not make the weight exogenous. The significant weighted no-cutoff result indicates that the 30-permit minimum does not create the finding; the weaker unweighted no-cutoff result confirms that weighting still matters.</w:t>
       </w:r>
     </w:p>
     <w:p>
@@ -23608,7 +23434,7 @@
         </w:rPr>
       </w:pPr>
       <w:r>
-        <w:t>Because the sensitivity specifications reuse the same panel, some coefficients could appear significant by chance. Selecting the preferred model before examining the results limits specification searching. Separately, the wild-cluster bootstrap addresses inference with 30 destination clusters. Neither step adjusts all robustness results for multiple testing or makes the estimate causal.</w:t>
+        <w:t>Because the sensitivity specifications reuse the same panel, some coefficients could appear significant by chance. Selecting the preferred model before examining the results limits specification searching. Separately, the wild-cluster bootstrap addresses inference with 30 destination clusters. Neither step adjusts all robustness results for multiple testing.</w:t>
       </w:r>
     </w:p>
     <w:p>
@@ -23627,7 +23453,7 @@
         <w:jc w:val="both"/>
       </w:pPr>
       <w:r>
-        <w:t>First, the preferred estimate suggests that cumulative net restrictive change in general labor-migration policy is associated with the composition of permits issued in the following year. General all-migrant-worker reforms are associated with a higher high-skilled permit share. Supporting count models show a positive association with the measured high-skilled permit count but no statistically detectable association with the total employment-permit count. Because these models have different effective samples, they should not be interpreted as a formal decomposition of the share result.</w:t>
+        <w:t>First, the preferred estimate suggests that cumulative net restrictive change in general labor-migration policy is associated with the composition of permits issued in the following year. General all-migrant-worker reforms are associated with a higher high-skilled permit share. Supporting count models show a positive association with the measured high-skilled permit count but no statistically detectable association with the total employment-permit count.</w:t>
       </w:r>
     </w:p>
     <w:p>
@@ -23638,24 +23464,11 @@
         <w:jc w:val="both"/>
       </w:pPr>
       <w:r>
+        <w:t xml:space="preserve">Because larger permit corridors receive greater weight, the estimate is most informative about composition across the permits actually issued rather than about the average migration corridor. Policymakers should not interpret the positive share estimate as evidence that tighter general </w:t>
+      </w:r>
+      <w:r>
         <w:lastRenderedPageBreak/>
-        <w:t xml:space="preserve">Because larger permit corridors receive greater weight, the estimate is most informative about composition across the permits </w:t>
-      </w:r>
-      <w:proofErr w:type="gramStart"/>
-      <w:r>
-        <w:t>actually issued</w:t>
-      </w:r>
-      <w:proofErr w:type="gramEnd"/>
-      <w:r>
-        <w:t xml:space="preserve"> rather than about the average migration corridor. Policymakers should not interpret the positive share estimate as evidence that tighter general rules automatically attract skilled migrants or reduce low-skilled immigration. </w:t>
-      </w:r>
-      <w:proofErr w:type="spellStart"/>
-      <w:r>
-        <w:t>HSRate</w:t>
-      </w:r>
-      <w:proofErr w:type="spellEnd"/>
-      <w:r>
-        <w:t xml:space="preserve"> measures administrative first-permit categories, and the residual category includes all employment permits outside the main high-skilled categories, not only low-skilled permits. Nor does a higher share establish an economic benefit, because the thesis does not estimate effects on vacancies, productivity, labor shortages, fiscal outcomes, integration, or migrant welfare. Since the estimates are associational, model-dependent, and based on a cumulative measure combining heterogeneous reforms, they should not be used to predict the effect of a particular policy tool without separate evaluation.</w:t>
+        <w:t>rules automatically attract skilled migrants or reduce low-skilled immigration. The residual category includes all employment permits outside the main high-skilled categories, not only low-skilled permits. The policy-direction diagnostic in Section 8.3 reinforces this caution: the association is clearest on the liberalizing side, so the results do not show that new tightening would raise the high-skilled share. Nor does a higher share establish an economic benefit, because the thesis does not estimate effects on vacancies, productivity, labor shortages, fiscal outcomes, integration, or migrant welfare. Since the estimates are associational, model-dependent, and based on a cumulative measure combining heterogeneous reforms, they should not be used to predict the effect of a particular policy tool without separate evaluation.</w:t>
       </w:r>
     </w:p>
     <w:p>
@@ -23721,7 +23534,7 @@
           <w:sz w:val="22"/>
           <w:szCs w:val="22"/>
         </w:rPr>
-        <w:t>This thesis examined whether changes in the restrictiveness of general labor-migration policy are associated with the skill composition of long-term employment-related immigration in European destinations between 2008 and 2019. The aggregate country-year models provide no statistically significant evidence of such an association. By contrast, the preferred denominator-weighted bilateral model, which accounts for destination fixed effects, origin-year pressures, and policies targeting high- and low-skilled workers separately, finds that one additional unit of cumulative net restrictive change is associated with approximately a 0.65-percentage-point increase in the high-skilled share of employment-related first permits. The result remains positive across several alternative specifications, although its sensitivity to destination-specific trends shows that it should be understood as a conditional association rather than a causal effect.</w:t>
+        <w:t>This thesis examined whether changes in the restrictiveness of general labor-migration policy are associated with the skill composition of long-term employment-related immigration in European destinations between 2008 and 2019. The aggregate country-year models provide no statistically significant evidence of such an association. By contrast, the preferred denominator-weighted bilateral model, which accounts for destination fixed effects, origin-year pressures, and policies targeting high- and low-skilled workers separately, finds that one additional unit of cumulative net restrictive change is associated with approximately a 0.65-percentage-point increase in the high-skilled share of employment-related first permits. The result remains positive across several alternative specifications, although it is not statistically significant when the United Kingdom is included in the sample or when destination-specific linear trends are added, so it should be understood as a conditional association rather than a causal effect.</w:t>
       </w:r>
     </w:p>
     <w:p>
@@ -24643,13 +24456,7 @@
       </w:pPr>
       <w:r>
         <w:lastRenderedPageBreak/>
-        <w:t>13. Appendix</w:t>
-      </w:r>
-      <w:r>
-        <w:t>:</w:t>
-      </w:r>
-      <w:r>
-        <w:t xml:space="preserve"> Extended-window PPML sensitivity</w:t>
+        <w:t>13. Appendix: Extended-window PPML sensitivity</w:t>
       </w:r>
     </w:p>
     <w:p>
@@ -25360,7 +25167,7 @@
 </file>
 
 <file path=word/endnotes.xml><?xml version="1.0" encoding="utf-8"?>
-<w:endnotes xmlns:wpc="http://schemas.microsoft.com/office/word/2010/wordprocessingCanvas" xmlns:cx="http://schemas.microsoft.com/office/drawing/2014/chartex" xmlns:cx1="http://schemas.microsoft.com/office/drawing/2015/9/8/chartex" xmlns:cx2="http://schemas.microsoft.com/office/drawing/2015/10/21/chartex" xmlns:cx3="http://schemas.microsoft.com/office/drawing/2016/5/9/chartex" xmlns:cx4="http://schemas.microsoft.com/office/drawing/2016/5/10/chartex" xmlns:cx5="http://schemas.microsoft.com/office/drawing/2016/5/11/chartex" xmlns:cx6="http://schemas.microsoft.com/office/drawing/2016/5/12/chartex" xmlns:cx7="http://schemas.microsoft.com/office/drawing/2016/5/13/chartex" xmlns:cx8="http://schemas.microsoft.com/office/drawing/2016/5/14/chartex" xmlns:mc="http://schemas.openxmlformats.org/markup-compatibility/2006" xmlns:m="http://schemas.openxmlformats.org/officeDocument/2006/math" xmlns:aink="http://schemas.microsoft.com/office/drawing/2016/ink" xmlns:am3d="http://schemas.microsoft.com/office/drawing/2017/model3d" xmlns:oel="http://schemas.microsoft.com/office/2019/extlst" xmlns:r="http://schemas.openxmlformats.org/officeDocument/2006/relationships" xmlns:wp14="http://schemas.microsoft.com/office/word/2010/wordprocessingDrawing" xmlns:wp="http://schemas.openxmlformats.org/drawingml/2006/wordprocessingDrawing" xmlns:wpg="http://schemas.microsoft.com/office/word/2010/wordprocessingGroup" xmlns:wpi="http://schemas.microsoft.com/office/word/2010/wordprocessingInk" xmlns:wps="http://schemas.microsoft.com/office/word/2010/wordprocessingShape" xmlns:o="urn:schemas-microsoft-com:office:office" xmlns:v="urn:schemas-microsoft-com:vml" xmlns:w10="urn:schemas-microsoft-com:office:word" xmlns:w="http://schemas.openxmlformats.org/wordprocessingml/2006/main" xmlns:w14="http://schemas.microsoft.com/office/word/2010/wordml" xmlns:w15="http://schemas.microsoft.com/office/word/2012/wordml" xmlns:w16cex="http://schemas.microsoft.com/office/word/2018/wordml/cex" xmlns:w16cid="http://schemas.microsoft.com/office/word/2016/wordml/cid" xmlns:w16="http://schemas.microsoft.com/office/word/2018/wordml" xmlns:w16sdtdh="http://schemas.microsoft.com/office/word/2020/wordml/sdtdatahash" xmlns:w16sdtfl="http://schemas.microsoft.com/office/word/2024/wordml/sdtformatlock" xmlns:w16se="http://schemas.microsoft.com/office/word/2015/wordml/symex" xmlns:w16du="http://schemas.microsoft.com/office/word/2023/wordml/word16du" xmlns:wne="http://schemas.microsoft.com/office/word/2006/wordml" mc:Ignorable="w14 w15 w16se w16cid w16 w16cex w16sdtdh w16sdtfl w16du wp14">
+<w:endnotes xmlns:wpc="http://schemas.microsoft.com/office/word/2010/wordprocessingCanvas" xmlns:cx="http://schemas.microsoft.com/office/drawing/2014/chartex" xmlns:cx1="http://schemas.microsoft.com/office/drawing/2015/9/8/chartex" xmlns:cx2="http://schemas.microsoft.com/office/drawing/2015/10/21/chartex" xmlns:cx3="http://schemas.microsoft.com/office/drawing/2016/5/9/chartex" xmlns:cx4="http://schemas.microsoft.com/office/drawing/2016/5/10/chartex" xmlns:cx5="http://schemas.microsoft.com/office/drawing/2016/5/11/chartex" xmlns:cx6="http://schemas.microsoft.com/office/drawing/2016/5/12/chartex" xmlns:cx7="http://schemas.microsoft.com/office/drawing/2016/5/13/chartex" xmlns:cx8="http://schemas.microsoft.com/office/drawing/2016/5/14/chartex" xmlns:mc="http://schemas.openxmlformats.org/markup-compatibility/2006" xmlns:m="http://schemas.openxmlformats.org/officeDocument/2006/math" xmlns:aink="http://schemas.microsoft.com/office/drawing/2016/ink" xmlns:am3d="http://schemas.microsoft.com/office/drawing/2017/model3d" xmlns:oel="http://schemas.microsoft.com/office/2019/extlst" xmlns:r="http://schemas.openxmlformats.org/officeDocument/2006/relationships" xmlns:wp14="http://schemas.microsoft.com/office/word/2010/wordprocessingDrawing" xmlns:wp="http://schemas.openxmlformats.org/drawingml/2006/wordprocessingDrawing" xmlns:wpg="http://schemas.microsoft.com/office/word/2010/wordprocessingGroup" xmlns:wpi="http://schemas.microsoft.com/office/word/2010/wordprocessingInk" xmlns:wps="http://schemas.microsoft.com/office/word/2010/wordprocessingShape" xmlns:o="urn:schemas-microsoft-com:office:office" xmlns:v="urn:schemas-microsoft-com:vml" xmlns:w10="urn:schemas-microsoft-com:office:word" xmlns:w="http://schemas.openxmlformats.org/wordprocessingml/2006/main" xmlns:w14="http://schemas.microsoft.com/office/word/2010/wordml" xmlns:w15="http://schemas.microsoft.com/office/word/2012/wordml" xmlns:w16cei="http://schemas.microsoft.com/office/word/2026/wordml/cei" xmlns:w16cex="http://schemas.microsoft.com/office/word/2018/wordml/cex" xmlns:w16cid="http://schemas.microsoft.com/office/word/2016/wordml/cid" xmlns:w16="http://schemas.microsoft.com/office/word/2018/wordml" xmlns:w16sdtdh="http://schemas.microsoft.com/office/word/2020/wordml/sdtdatahash" xmlns:w16sdtfl="http://schemas.microsoft.com/office/word/2024/wordml/sdtformatlock" xmlns:w16se="http://schemas.microsoft.com/office/word/2015/wordml/symex" xmlns:w16du="http://schemas.microsoft.com/office/word/2023/wordml/word16du" xmlns:wne="http://schemas.microsoft.com/office/word/2006/wordml" mc:Ignorable="w14 w15 w16se w16cid w16 w16cex w16sdtdh w16sdtfl w16du wp14">
   <w:endnote w:type="separator" w:id="-1">
     <w:p>
       <w:pPr>
@@ -25385,7 +25192,7 @@
 </file>
 
 <file path=word/footer1.xml><?xml version="1.0" encoding="utf-8"?>
-<w:ftr xmlns:wpc="http://schemas.microsoft.com/office/word/2010/wordprocessingCanvas" xmlns:cx="http://schemas.microsoft.com/office/drawing/2014/chartex" xmlns:cx1="http://schemas.microsoft.com/office/drawing/2015/9/8/chartex" xmlns:cx2="http://schemas.microsoft.com/office/drawing/2015/10/21/chartex" xmlns:cx3="http://schemas.microsoft.com/office/drawing/2016/5/9/chartex" xmlns:cx4="http://schemas.microsoft.com/office/drawing/2016/5/10/chartex" xmlns:cx5="http://schemas.microsoft.com/office/drawing/2016/5/11/chartex" xmlns:cx6="http://schemas.microsoft.com/office/drawing/2016/5/12/chartex" xmlns:cx7="http://schemas.microsoft.com/office/drawing/2016/5/13/chartex" xmlns:cx8="http://schemas.microsoft.com/office/drawing/2016/5/14/chartex" xmlns:mc="http://schemas.openxmlformats.org/markup-compatibility/2006" xmlns:m="http://schemas.openxmlformats.org/officeDocument/2006/math" xmlns:aink="http://schemas.microsoft.com/office/drawing/2016/ink" xmlns:am3d="http://schemas.microsoft.com/office/drawing/2017/model3d" xmlns:oel="http://schemas.microsoft.com/office/2019/extlst" xmlns:r="http://schemas.openxmlformats.org/officeDocument/2006/relationships" xmlns:wp14="http://schemas.microsoft.com/office/word/2010/wordprocessingDrawing" xmlns:wp="http://schemas.openxmlformats.org/drawingml/2006/wordprocessingDrawing" xmlns:wpg="http://schemas.microsoft.com/office/word/2010/wordprocessingGroup" xmlns:wpi="http://schemas.microsoft.com/office/word/2010/wordprocessingInk" xmlns:wps="http://schemas.microsoft.com/office/word/2010/wordprocessingShape" xmlns:o="urn:schemas-microsoft-com:office:office" xmlns:v="urn:schemas-microsoft-com:vml" xmlns:w10="urn:schemas-microsoft-com:office:word" xmlns:w="http://schemas.openxmlformats.org/wordprocessingml/2006/main" xmlns:w14="http://schemas.microsoft.com/office/word/2010/wordml" xmlns:w15="http://schemas.microsoft.com/office/word/2012/wordml" xmlns:w16cex="http://schemas.microsoft.com/office/word/2018/wordml/cex" xmlns:w16cid="http://schemas.microsoft.com/office/word/2016/wordml/cid" xmlns:w16="http://schemas.microsoft.com/office/word/2018/wordml" xmlns:w16sdtdh="http://schemas.microsoft.com/office/word/2020/wordml/sdtdatahash" xmlns:w16sdtfl="http://schemas.microsoft.com/office/word/2024/wordml/sdtformatlock" xmlns:w16se="http://schemas.microsoft.com/office/word/2015/wordml/symex" xmlns:w16du="http://schemas.microsoft.com/office/word/2023/wordml/word16du" xmlns:wne="http://schemas.microsoft.com/office/word/2006/wordml" mc:Ignorable="w14 w15 w16se w16cid w16 w16cex w16sdtdh w16sdtfl w16du wp14">
+<w:ftr xmlns:wpc="http://schemas.microsoft.com/office/word/2010/wordprocessingCanvas" xmlns:cx="http://schemas.microsoft.com/office/drawing/2014/chartex" xmlns:cx1="http://schemas.microsoft.com/office/drawing/2015/9/8/chartex" xmlns:cx2="http://schemas.microsoft.com/office/drawing/2015/10/21/chartex" xmlns:cx3="http://schemas.microsoft.com/office/drawing/2016/5/9/chartex" xmlns:cx4="http://schemas.microsoft.com/office/drawing/2016/5/10/chartex" xmlns:cx5="http://schemas.microsoft.com/office/drawing/2016/5/11/chartex" xmlns:cx6="http://schemas.microsoft.com/office/drawing/2016/5/12/chartex" xmlns:cx7="http://schemas.microsoft.com/office/drawing/2016/5/13/chartex" xmlns:cx8="http://schemas.microsoft.com/office/drawing/2016/5/14/chartex" xmlns:mc="http://schemas.openxmlformats.org/markup-compatibility/2006" xmlns:m="http://schemas.openxmlformats.org/officeDocument/2006/math" xmlns:aink="http://schemas.microsoft.com/office/drawing/2016/ink" xmlns:am3d="http://schemas.microsoft.com/office/drawing/2017/model3d" xmlns:oel="http://schemas.microsoft.com/office/2019/extlst" xmlns:r="http://schemas.openxmlformats.org/officeDocument/2006/relationships" xmlns:wp14="http://schemas.microsoft.com/office/word/2010/wordprocessingDrawing" xmlns:wp="http://schemas.openxmlformats.org/drawingml/2006/wordprocessingDrawing" xmlns:wpg="http://schemas.microsoft.com/office/word/2010/wordprocessingGroup" xmlns:wpi="http://schemas.microsoft.com/office/word/2010/wordprocessingInk" xmlns:wps="http://schemas.microsoft.com/office/word/2010/wordprocessingShape" xmlns:o="urn:schemas-microsoft-com:office:office" xmlns:v="urn:schemas-microsoft-com:vml" xmlns:w10="urn:schemas-microsoft-com:office:word" xmlns:w="http://schemas.openxmlformats.org/wordprocessingml/2006/main" xmlns:w14="http://schemas.microsoft.com/office/word/2010/wordml" xmlns:w15="http://schemas.microsoft.com/office/word/2012/wordml" xmlns:w16cei="http://schemas.microsoft.com/office/word/2026/wordml/cei" xmlns:w16cex="http://schemas.microsoft.com/office/word/2018/wordml/cex" xmlns:w16cid="http://schemas.microsoft.com/office/word/2016/wordml/cid" xmlns:w16="http://schemas.microsoft.com/office/word/2018/wordml" xmlns:w16sdtdh="http://schemas.microsoft.com/office/word/2020/wordml/sdtdatahash" xmlns:w16sdtfl="http://schemas.microsoft.com/office/word/2024/wordml/sdtformatlock" xmlns:w16se="http://schemas.microsoft.com/office/word/2015/wordml/symex" xmlns:w16du="http://schemas.microsoft.com/office/word/2023/wordml/word16du" xmlns:wne="http://schemas.microsoft.com/office/word/2006/wordml" mc:Ignorable="w14 w15 w16se w16cid w16 w16cex w16sdtdh w16sdtfl w16du wp14">
   <w:sdt>
     <w:sdtPr>
       <w:rPr>
@@ -25450,7 +25257,7 @@
 </file>
 
 <file path=word/footer2.xml><?xml version="1.0" encoding="utf-8"?>
-<w:ftr xmlns:wpc="http://schemas.microsoft.com/office/word/2010/wordprocessingCanvas" xmlns:cx="http://schemas.microsoft.com/office/drawing/2014/chartex" xmlns:cx1="http://schemas.microsoft.com/office/drawing/2015/9/8/chartex" xmlns:cx2="http://schemas.microsoft.com/office/drawing/2015/10/21/chartex" xmlns:cx3="http://schemas.microsoft.com/office/drawing/2016/5/9/chartex" xmlns:cx4="http://schemas.microsoft.com/office/drawing/2016/5/10/chartex" xmlns:cx5="http://schemas.microsoft.com/office/drawing/2016/5/11/chartex" xmlns:cx6="http://schemas.microsoft.com/office/drawing/2016/5/12/chartex" xmlns:cx7="http://schemas.microsoft.com/office/drawing/2016/5/13/chartex" xmlns:cx8="http://schemas.microsoft.com/office/drawing/2016/5/14/chartex" xmlns:mc="http://schemas.openxmlformats.org/markup-compatibility/2006" xmlns:m="http://schemas.openxmlformats.org/officeDocument/2006/math" xmlns:aink="http://schemas.microsoft.com/office/drawing/2016/ink" xmlns:am3d="http://schemas.microsoft.com/office/drawing/2017/model3d" xmlns:oel="http://schemas.microsoft.com/office/2019/extlst" xmlns:r="http://schemas.openxmlformats.org/officeDocument/2006/relationships" xmlns:wp14="http://schemas.microsoft.com/office/word/2010/wordprocessingDrawing" xmlns:wp="http://schemas.openxmlformats.org/drawingml/2006/wordprocessingDrawing" xmlns:wpg="http://schemas.microsoft.com/office/word/2010/wordprocessingGroup" xmlns:wpi="http://schemas.microsoft.com/office/word/2010/wordprocessingInk" xmlns:wps="http://schemas.microsoft.com/office/word/2010/wordprocessingShape" xmlns:o="urn:schemas-microsoft-com:office:office" xmlns:v="urn:schemas-microsoft-com:vml" xmlns:w10="urn:schemas-microsoft-com:office:word" xmlns:w="http://schemas.openxmlformats.org/wordprocessingml/2006/main" xmlns:w14="http://schemas.microsoft.com/office/word/2010/wordml" xmlns:w15="http://schemas.microsoft.com/office/word/2012/wordml" xmlns:w16cex="http://schemas.microsoft.com/office/word/2018/wordml/cex" xmlns:w16cid="http://schemas.microsoft.com/office/word/2016/wordml/cid" xmlns:w16="http://schemas.microsoft.com/office/word/2018/wordml" xmlns:w16sdtdh="http://schemas.microsoft.com/office/word/2020/wordml/sdtdatahash" xmlns:w16sdtfl="http://schemas.microsoft.com/office/word/2024/wordml/sdtformatlock" xmlns:w16se="http://schemas.microsoft.com/office/word/2015/wordml/symex" xmlns:w16du="http://schemas.microsoft.com/office/word/2023/wordml/word16du" xmlns:wne="http://schemas.microsoft.com/office/word/2006/wordml" mc:Ignorable="w14 w15 w16se w16cid w16 w16cex w16sdtdh w16sdtfl w16du wp14">
+<w:ftr xmlns:wpc="http://schemas.microsoft.com/office/word/2010/wordprocessingCanvas" xmlns:cx="http://schemas.microsoft.com/office/drawing/2014/chartex" xmlns:cx1="http://schemas.microsoft.com/office/drawing/2015/9/8/chartex" xmlns:cx2="http://schemas.microsoft.com/office/drawing/2015/10/21/chartex" xmlns:cx3="http://schemas.microsoft.com/office/drawing/2016/5/9/chartex" xmlns:cx4="http://schemas.microsoft.com/office/drawing/2016/5/10/chartex" xmlns:cx5="http://schemas.microsoft.com/office/drawing/2016/5/11/chartex" xmlns:cx6="http://schemas.microsoft.com/office/drawing/2016/5/12/chartex" xmlns:cx7="http://schemas.microsoft.com/office/drawing/2016/5/13/chartex" xmlns:cx8="http://schemas.microsoft.com/office/drawing/2016/5/14/chartex" xmlns:mc="http://schemas.openxmlformats.org/markup-compatibility/2006" xmlns:m="http://schemas.openxmlformats.org/officeDocument/2006/math" xmlns:aink="http://schemas.microsoft.com/office/drawing/2016/ink" xmlns:am3d="http://schemas.microsoft.com/office/drawing/2017/model3d" xmlns:oel="http://schemas.microsoft.com/office/2019/extlst" xmlns:r="http://schemas.openxmlformats.org/officeDocument/2006/relationships" xmlns:wp14="http://schemas.microsoft.com/office/word/2010/wordprocessingDrawing" xmlns:wp="http://schemas.openxmlformats.org/drawingml/2006/wordprocessingDrawing" xmlns:wpg="http://schemas.microsoft.com/office/word/2010/wordprocessingGroup" xmlns:wpi="http://schemas.microsoft.com/office/word/2010/wordprocessingInk" xmlns:wps="http://schemas.microsoft.com/office/word/2010/wordprocessingShape" xmlns:o="urn:schemas-microsoft-com:office:office" xmlns:v="urn:schemas-microsoft-com:vml" xmlns:w10="urn:schemas-microsoft-com:office:word" xmlns:w="http://schemas.openxmlformats.org/wordprocessingml/2006/main" xmlns:w14="http://schemas.microsoft.com/office/word/2010/wordml" xmlns:w15="http://schemas.microsoft.com/office/word/2012/wordml" xmlns:w16cei="http://schemas.microsoft.com/office/word/2026/wordml/cei" xmlns:w16cex="http://schemas.microsoft.com/office/word/2018/wordml/cex" xmlns:w16cid="http://schemas.microsoft.com/office/word/2016/wordml/cid" xmlns:w16="http://schemas.microsoft.com/office/word/2018/wordml" xmlns:w16sdtdh="http://schemas.microsoft.com/office/word/2020/wordml/sdtdatahash" xmlns:w16sdtfl="http://schemas.microsoft.com/office/word/2024/wordml/sdtformatlock" xmlns:w16se="http://schemas.microsoft.com/office/word/2015/wordml/symex" xmlns:w16du="http://schemas.microsoft.com/office/word/2023/wordml/word16du" xmlns:wne="http://schemas.microsoft.com/office/word/2006/wordml" mc:Ignorable="w14 w15 w16se w16cid w16 w16cex w16sdtdh w16sdtfl w16du wp14">
   <w:sdt>
     <w:sdtPr>
       <w:rPr>
@@ -25516,7 +25323,7 @@
 </file>
 
 <file path=word/footer3.xml><?xml version="1.0" encoding="utf-8"?>
-<w:ftr xmlns:wpc="http://schemas.microsoft.com/office/word/2010/wordprocessingCanvas" xmlns:cx="http://schemas.microsoft.com/office/drawing/2014/chartex" xmlns:cx1="http://schemas.microsoft.com/office/drawing/2015/9/8/chartex" xmlns:cx2="http://schemas.microsoft.com/office/drawing/2015/10/21/chartex" xmlns:cx3="http://schemas.microsoft.com/office/drawing/2016/5/9/chartex" xmlns:cx4="http://schemas.microsoft.com/office/drawing/2016/5/10/chartex" xmlns:cx5="http://schemas.microsoft.com/office/drawing/2016/5/11/chartex" xmlns:cx6="http://schemas.microsoft.com/office/drawing/2016/5/12/chartex" xmlns:cx7="http://schemas.microsoft.com/office/drawing/2016/5/13/chartex" xmlns:cx8="http://schemas.microsoft.com/office/drawing/2016/5/14/chartex" xmlns:mc="http://schemas.openxmlformats.org/markup-compatibility/2006" xmlns:m="http://schemas.openxmlformats.org/officeDocument/2006/math" xmlns:aink="http://schemas.microsoft.com/office/drawing/2016/ink" xmlns:am3d="http://schemas.microsoft.com/office/drawing/2017/model3d" xmlns:oel="http://schemas.microsoft.com/office/2019/extlst" xmlns:r="http://schemas.openxmlformats.org/officeDocument/2006/relationships" xmlns:wp14="http://schemas.microsoft.com/office/word/2010/wordprocessingDrawing" xmlns:wp="http://schemas.openxmlformats.org/drawingml/2006/wordprocessingDrawing" xmlns:wpg="http://schemas.microsoft.com/office/word/2010/wordprocessingGroup" xmlns:wpi="http://schemas.microsoft.com/office/word/2010/wordprocessingInk" xmlns:wps="http://schemas.microsoft.com/office/word/2010/wordprocessingShape" xmlns:o="urn:schemas-microsoft-com:office:office" xmlns:v="urn:schemas-microsoft-com:vml" xmlns:w10="urn:schemas-microsoft-com:office:word" xmlns:w="http://schemas.openxmlformats.org/wordprocessingml/2006/main" xmlns:w14="http://schemas.microsoft.com/office/word/2010/wordml" xmlns:w15="http://schemas.microsoft.com/office/word/2012/wordml" xmlns:w16cex="http://schemas.microsoft.com/office/word/2018/wordml/cex" xmlns:w16cid="http://schemas.microsoft.com/office/word/2016/wordml/cid" xmlns:w16="http://schemas.microsoft.com/office/word/2018/wordml" xmlns:w16sdtdh="http://schemas.microsoft.com/office/word/2020/wordml/sdtdatahash" xmlns:w16sdtfl="http://schemas.microsoft.com/office/word/2024/wordml/sdtformatlock" xmlns:w16se="http://schemas.microsoft.com/office/word/2015/wordml/symex" xmlns:w16du="http://schemas.microsoft.com/office/word/2023/wordml/word16du" xmlns:wne="http://schemas.microsoft.com/office/word/2006/wordml" mc:Ignorable="w14 w15 w16se w16cid w16 w16cex w16sdtdh w16sdtfl w16du wp14">
+<w:ftr xmlns:wpc="http://schemas.microsoft.com/office/word/2010/wordprocessingCanvas" xmlns:cx="http://schemas.microsoft.com/office/drawing/2014/chartex" xmlns:cx1="http://schemas.microsoft.com/office/drawing/2015/9/8/chartex" xmlns:cx2="http://schemas.microsoft.com/office/drawing/2015/10/21/chartex" xmlns:cx3="http://schemas.microsoft.com/office/drawing/2016/5/9/chartex" xmlns:cx4="http://schemas.microsoft.com/office/drawing/2016/5/10/chartex" xmlns:cx5="http://schemas.microsoft.com/office/drawing/2016/5/11/chartex" xmlns:cx6="http://schemas.microsoft.com/office/drawing/2016/5/12/chartex" xmlns:cx7="http://schemas.microsoft.com/office/drawing/2016/5/13/chartex" xmlns:cx8="http://schemas.microsoft.com/office/drawing/2016/5/14/chartex" xmlns:mc="http://schemas.openxmlformats.org/markup-compatibility/2006" xmlns:m="http://schemas.openxmlformats.org/officeDocument/2006/math" xmlns:aink="http://schemas.microsoft.com/office/drawing/2016/ink" xmlns:am3d="http://schemas.microsoft.com/office/drawing/2017/model3d" xmlns:oel="http://schemas.microsoft.com/office/2019/extlst" xmlns:r="http://schemas.openxmlformats.org/officeDocument/2006/relationships" xmlns:wp14="http://schemas.microsoft.com/office/word/2010/wordprocessingDrawing" xmlns:wp="http://schemas.openxmlformats.org/drawingml/2006/wordprocessingDrawing" xmlns:wpg="http://schemas.microsoft.com/office/word/2010/wordprocessingGroup" xmlns:wpi="http://schemas.microsoft.com/office/word/2010/wordprocessingInk" xmlns:wps="http://schemas.microsoft.com/office/word/2010/wordprocessingShape" xmlns:o="urn:schemas-microsoft-com:office:office" xmlns:v="urn:schemas-microsoft-com:vml" xmlns:w10="urn:schemas-microsoft-com:office:word" xmlns:w="http://schemas.openxmlformats.org/wordprocessingml/2006/main" xmlns:w14="http://schemas.microsoft.com/office/word/2010/wordml" xmlns:w15="http://schemas.microsoft.com/office/word/2012/wordml" xmlns:w16cei="http://schemas.microsoft.com/office/word/2026/wordml/cei" xmlns:w16cex="http://schemas.microsoft.com/office/word/2018/wordml/cex" xmlns:w16cid="http://schemas.microsoft.com/office/word/2016/wordml/cid" xmlns:w16="http://schemas.microsoft.com/office/word/2018/wordml" xmlns:w16sdtdh="http://schemas.microsoft.com/office/word/2020/wordml/sdtdatahash" xmlns:w16sdtfl="http://schemas.microsoft.com/office/word/2024/wordml/sdtformatlock" xmlns:w16se="http://schemas.microsoft.com/office/word/2015/wordml/symex" xmlns:w16du="http://schemas.microsoft.com/office/word/2023/wordml/word16du" xmlns:wne="http://schemas.microsoft.com/office/word/2006/wordml" mc:Ignorable="w14 w15 w16se w16cid w16 w16cex w16sdtdh w16sdtfl w16du wp14">
   <w:p>
     <w:pPr>
       <w:pStyle w:val="Footer"/>
@@ -25527,7 +25334,7 @@
 </file>
 
 <file path=word/footnotes.xml><?xml version="1.0" encoding="utf-8"?>
-<w:footnotes xmlns:wpc="http://schemas.microsoft.com/office/word/2010/wordprocessingCanvas" xmlns:cx="http://schemas.microsoft.com/office/drawing/2014/chartex" xmlns:cx1="http://schemas.microsoft.com/office/drawing/2015/9/8/chartex" xmlns:cx2="http://schemas.microsoft.com/office/drawing/2015/10/21/chartex" xmlns:cx3="http://schemas.microsoft.com/office/drawing/2016/5/9/chartex" xmlns:cx4="http://schemas.microsoft.com/office/drawing/2016/5/10/chartex" xmlns:cx5="http://schemas.microsoft.com/office/drawing/2016/5/11/chartex" xmlns:cx6="http://schemas.microsoft.com/office/drawing/2016/5/12/chartex" xmlns:cx7="http://schemas.microsoft.com/office/drawing/2016/5/13/chartex" xmlns:cx8="http://schemas.microsoft.com/office/drawing/2016/5/14/chartex" xmlns:mc="http://schemas.openxmlformats.org/markup-compatibility/2006" xmlns:m="http://schemas.openxmlformats.org/officeDocument/2006/math" xmlns:aink="http://schemas.microsoft.com/office/drawing/2016/ink" xmlns:am3d="http://schemas.microsoft.com/office/drawing/2017/model3d" xmlns:oel="http://schemas.microsoft.com/office/2019/extlst" xmlns:r="http://schemas.openxmlformats.org/officeDocument/2006/relationships" xmlns:wp14="http://schemas.microsoft.com/office/word/2010/wordprocessingDrawing" xmlns:wp="http://schemas.openxmlformats.org/drawingml/2006/wordprocessingDrawing" xmlns:wpg="http://schemas.microsoft.com/office/word/2010/wordprocessingGroup" xmlns:wpi="http://schemas.microsoft.com/office/word/2010/wordprocessingInk" xmlns:wps="http://schemas.microsoft.com/office/word/2010/wordprocessingShape" xmlns:o="urn:schemas-microsoft-com:office:office" xmlns:v="urn:schemas-microsoft-com:vml" xmlns:w10="urn:schemas-microsoft-com:office:word" xmlns:w="http://schemas.openxmlformats.org/wordprocessingml/2006/main" xmlns:w14="http://schemas.microsoft.com/office/word/2010/wordml" xmlns:w15="http://schemas.microsoft.com/office/word/2012/wordml" xmlns:w16cex="http://schemas.microsoft.com/office/word/2018/wordml/cex" xmlns:w16cid="http://schemas.microsoft.com/office/word/2016/wordml/cid" xmlns:w16="http://schemas.microsoft.com/office/word/2018/wordml" xmlns:w16sdtdh="http://schemas.microsoft.com/office/word/2020/wordml/sdtdatahash" xmlns:w16sdtfl="http://schemas.microsoft.com/office/word/2024/wordml/sdtformatlock" xmlns:w16se="http://schemas.microsoft.com/office/word/2015/wordml/symex" xmlns:w16du="http://schemas.microsoft.com/office/word/2023/wordml/word16du" xmlns:wne="http://schemas.microsoft.com/office/word/2006/wordml" mc:Ignorable="w14 w15 w16se w16cid w16 w16cex w16sdtdh w16sdtfl w16du wp14">
+<w:footnotes xmlns:wpc="http://schemas.microsoft.com/office/word/2010/wordprocessingCanvas" xmlns:cx="http://schemas.microsoft.com/office/drawing/2014/chartex" xmlns:cx1="http://schemas.microsoft.com/office/drawing/2015/9/8/chartex" xmlns:cx2="http://schemas.microsoft.com/office/drawing/2015/10/21/chartex" xmlns:cx3="http://schemas.microsoft.com/office/drawing/2016/5/9/chartex" xmlns:cx4="http://schemas.microsoft.com/office/drawing/2016/5/10/chartex" xmlns:cx5="http://schemas.microsoft.com/office/drawing/2016/5/11/chartex" xmlns:cx6="http://schemas.microsoft.com/office/drawing/2016/5/12/chartex" xmlns:cx7="http://schemas.microsoft.com/office/drawing/2016/5/13/chartex" xmlns:cx8="http://schemas.microsoft.com/office/drawing/2016/5/14/chartex" xmlns:mc="http://schemas.openxmlformats.org/markup-compatibility/2006" xmlns:m="http://schemas.openxmlformats.org/officeDocument/2006/math" xmlns:aink="http://schemas.microsoft.com/office/drawing/2016/ink" xmlns:am3d="http://schemas.microsoft.com/office/drawing/2017/model3d" xmlns:oel="http://schemas.microsoft.com/office/2019/extlst" xmlns:r="http://schemas.openxmlformats.org/officeDocument/2006/relationships" xmlns:wp14="http://schemas.microsoft.com/office/word/2010/wordprocessingDrawing" xmlns:wp="http://schemas.openxmlformats.org/drawingml/2006/wordprocessingDrawing" xmlns:wpg="http://schemas.microsoft.com/office/word/2010/wordprocessingGroup" xmlns:wpi="http://schemas.microsoft.com/office/word/2010/wordprocessingInk" xmlns:wps="http://schemas.microsoft.com/office/word/2010/wordprocessingShape" xmlns:o="urn:schemas-microsoft-com:office:office" xmlns:v="urn:schemas-microsoft-com:vml" xmlns:w10="urn:schemas-microsoft-com:office:word" xmlns:w="http://schemas.openxmlformats.org/wordprocessingml/2006/main" xmlns:w14="http://schemas.microsoft.com/office/word/2010/wordml" xmlns:w15="http://schemas.microsoft.com/office/word/2012/wordml" xmlns:w16cei="http://schemas.microsoft.com/office/word/2026/wordml/cei" xmlns:w16cex="http://schemas.microsoft.com/office/word/2018/wordml/cex" xmlns:w16cid="http://schemas.microsoft.com/office/word/2016/wordml/cid" xmlns:w16="http://schemas.microsoft.com/office/word/2018/wordml" xmlns:w16sdtdh="http://schemas.microsoft.com/office/word/2020/wordml/sdtdatahash" xmlns:w16sdtfl="http://schemas.microsoft.com/office/word/2024/wordml/sdtformatlock" xmlns:w16se="http://schemas.microsoft.com/office/word/2015/wordml/symex" xmlns:w16du="http://schemas.microsoft.com/office/word/2023/wordml/word16du" xmlns:wne="http://schemas.microsoft.com/office/word/2006/wordml" mc:Ignorable="w14 w15 w16se w16cid w16 w16cex w16sdtdh w16sdtfl w16du wp14">
   <w:footnote w:type="separator" w:id="-1">
     <w:p>
       <w:pPr>
@@ -25552,7 +25359,7 @@
 </file>
 
 <file path=word/numbering.xml><?xml version="1.0" encoding="utf-8"?>
-<w:numbering xmlns:wpc="http://schemas.microsoft.com/office/word/2010/wordprocessingCanvas" xmlns:cx="http://schemas.microsoft.com/office/drawing/2014/chartex" xmlns:cx1="http://schemas.microsoft.com/office/drawing/2015/9/8/chartex" xmlns:cx2="http://schemas.microsoft.com/office/drawing/2015/10/21/chartex" xmlns:cx3="http://schemas.microsoft.com/office/drawing/2016/5/9/chartex" xmlns:cx4="http://schemas.microsoft.com/office/drawing/2016/5/10/chartex" xmlns:cx5="http://schemas.microsoft.com/office/drawing/2016/5/11/chartex" xmlns:cx6="http://schemas.microsoft.com/office/drawing/2016/5/12/chartex" xmlns:cx7="http://schemas.microsoft.com/office/drawing/2016/5/13/chartex" xmlns:cx8="http://schemas.microsoft.com/office/drawing/2016/5/14/chartex" xmlns:mc="http://schemas.openxmlformats.org/markup-compatibility/2006" xmlns:m="http://schemas.openxmlformats.org/officeDocument/2006/math" xmlns:aink="http://schemas.microsoft.com/office/drawing/2016/ink" xmlns:am3d="http://schemas.microsoft.com/office/drawing/2017/model3d" xmlns:oel="http://schemas.microsoft.com/office/2019/extlst" xmlns:r="http://schemas.openxmlformats.org/officeDocument/2006/relationships" xmlns:wp14="http://schemas.microsoft.com/office/word/2010/wordprocessingDrawing" xmlns:wp="http://schemas.openxmlformats.org/drawingml/2006/wordprocessingDrawing" xmlns:wpg="http://schemas.microsoft.com/office/word/2010/wordprocessingGroup" xmlns:wpi="http://schemas.microsoft.com/office/word/2010/wordprocessingInk" xmlns:wps="http://schemas.microsoft.com/office/word/2010/wordprocessingShape" xmlns:o="urn:schemas-microsoft-com:office:office" xmlns:v="urn:schemas-microsoft-com:vml" xmlns:w10="urn:schemas-microsoft-com:office:word" xmlns:w="http://schemas.openxmlformats.org/wordprocessingml/2006/main" xmlns:w14="http://schemas.microsoft.com/office/word/2010/wordml" xmlns:w15="http://schemas.microsoft.com/office/word/2012/wordml" xmlns:w16cex="http://schemas.microsoft.com/office/word/2018/wordml/cex" xmlns:w16cid="http://schemas.microsoft.com/office/word/2016/wordml/cid" xmlns:w16="http://schemas.microsoft.com/office/word/2018/wordml" xmlns:w16sdtdh="http://schemas.microsoft.com/office/word/2020/wordml/sdtdatahash" xmlns:w16sdtfl="http://schemas.microsoft.com/office/word/2024/wordml/sdtformatlock" xmlns:w16se="http://schemas.microsoft.com/office/word/2015/wordml/symex" xmlns:w16du="http://schemas.microsoft.com/office/word/2023/wordml/word16du" xmlns:wne="http://schemas.microsoft.com/office/word/2006/wordml" mc:Ignorable="w14 w15 w16se w16cid w16 w16cex w16sdtdh w16sdtfl w16du wp14">
+<w:numbering xmlns:wpc="http://schemas.microsoft.com/office/word/2010/wordprocessingCanvas" xmlns:cx="http://schemas.microsoft.com/office/drawing/2014/chartex" xmlns:cx1="http://schemas.microsoft.com/office/drawing/2015/9/8/chartex" xmlns:cx2="http://schemas.microsoft.com/office/drawing/2015/10/21/chartex" xmlns:cx3="http://schemas.microsoft.com/office/drawing/2016/5/9/chartex" xmlns:cx4="http://schemas.microsoft.com/office/drawing/2016/5/10/chartex" xmlns:cx5="http://schemas.microsoft.com/office/drawing/2016/5/11/chartex" xmlns:cx6="http://schemas.microsoft.com/office/drawing/2016/5/12/chartex" xmlns:cx7="http://schemas.microsoft.com/office/drawing/2016/5/13/chartex" xmlns:cx8="http://schemas.microsoft.com/office/drawing/2016/5/14/chartex" xmlns:mc="http://schemas.openxmlformats.org/markup-compatibility/2006" xmlns:m="http://schemas.openxmlformats.org/officeDocument/2006/math" xmlns:aink="http://schemas.microsoft.com/office/drawing/2016/ink" xmlns:am3d="http://schemas.microsoft.com/office/drawing/2017/model3d" xmlns:oel="http://schemas.microsoft.com/office/2019/extlst" xmlns:r="http://schemas.openxmlformats.org/officeDocument/2006/relationships" xmlns:wp14="http://schemas.microsoft.com/office/word/2010/wordprocessingDrawing" xmlns:wp="http://schemas.openxmlformats.org/drawingml/2006/wordprocessingDrawing" xmlns:wpg="http://schemas.microsoft.com/office/word/2010/wordprocessingGroup" xmlns:wpi="http://schemas.microsoft.com/office/word/2010/wordprocessingInk" xmlns:wps="http://schemas.microsoft.com/office/word/2010/wordprocessingShape" xmlns:o="urn:schemas-microsoft-com:office:office" xmlns:v="urn:schemas-microsoft-com:vml" xmlns:w10="urn:schemas-microsoft-com:office:word" xmlns:w="http://schemas.openxmlformats.org/wordprocessingml/2006/main" xmlns:w14="http://schemas.microsoft.com/office/word/2010/wordml" xmlns:w15="http://schemas.microsoft.com/office/word/2012/wordml" xmlns:w16cei="http://schemas.microsoft.com/office/word/2026/wordml/cei" xmlns:w16cex="http://schemas.microsoft.com/office/word/2018/wordml/cex" xmlns:w16cid="http://schemas.microsoft.com/office/word/2016/wordml/cid" xmlns:w16="http://schemas.microsoft.com/office/word/2018/wordml" xmlns:w16sdtdh="http://schemas.microsoft.com/office/word/2020/wordml/sdtdatahash" xmlns:w16sdtfl="http://schemas.microsoft.com/office/word/2024/wordml/sdtformatlock" xmlns:w16se="http://schemas.microsoft.com/office/word/2015/wordml/symex" xmlns:w16du="http://schemas.microsoft.com/office/word/2023/wordml/word16du" xmlns:wne="http://schemas.microsoft.com/office/word/2006/wordml" mc:Ignorable="w14 w15 w16se w16cid w16 w16cex w16sdtdh w16sdtfl w16du wp14">
   <w:abstractNum w:abstractNumId="0" w15:restartNumberingAfterBreak="0">
     <w:nsid w:val="01BD5460"/>
     <w:multiLevelType w:val="multilevel"/>
@@ -27115,6 +26922,7 @@
   <w:style w:type="character" w:default="1" w:styleId="DefaultParagraphFont">
     <w:name w:val="Default Paragraph Font"/>
     <w:uiPriority w:val="1"/>
+    <w:semiHidden/>
     <w:unhideWhenUsed/>
   </w:style>
   <w:style w:type="table" w:default="1" w:styleId="TableNormal">

</xml_diff>

<commit_message>
Clarify future research on origin heterogeneity
</commit_message>
<xml_diff>
--- a/source/Toprak Thesis V23.docx
+++ b/source/Toprak Thesis V23.docx
@@ -23018,7 +23018,10 @@
         <w:rPr>
           <w:b/>
         </w:rPr>
-        <w:t>Policy-direction diagnostic. This exploratory check replaces the net cumulative Restrict score with separate cumulative totals for restrictive and liberalizing events, both of which enter the regression simultaneously. It uses the same bilateral sample, controls, and fixed effects as Equation (3), but does not apply denominator weights. Each retained corridor-year therefore receives equal weight, so large permit corridors do not automatically receive greater influence solely because of their permit volume. The liberalizing total has a negative and statistically significant coefficient (β = −0.006893, p = 0.005), while the restrictive total is imprecisely estimated (β = −0.002237, p = 0.551). The significant negative liberalizing coefficient therefore shows that the clearer association in this specification appears on the easing side. Conditional on the same controls and fixed effects, greater cumulative liberalization is associated with a lower high-skilled share, which is consistent with the main positive Restrict coefficient when read from the easing side. Liberalizing events account for about 62 percent of retained policy events. This imbalance may contribute to the greater precision of the liberalizing estimate. The diagnostic identifies the side of the net score carrying the clearer association.</w:t>
+        <w:t>Policy-direction diagnostic.</w:t>
+      </w:r>
+      <w:r>
+        <w:t xml:space="preserve"> This exploratory check replaces the net cumulative Restrict score with separate cumulative totals for restrictive and liberalizing events, both of which enter the regression simultaneously. It uses the same bilateral sample, controls, and fixed effects as Equation (3), but does not apply denominator weights. Each retained corridor-year therefore receives equal weight, so large permit corridors do not automatically receive greater influence solely because of their permit volume. The liberalizing total has a negative and statistically significant coefficient (β = −0.006893, p = 0.005), while the restrictive total is imprecisely estimated (β = −0.002237, p = 0.551). The significant negative liberalizing coefficient therefore shows that the clearer association in this specification appears on the easing side. Conditional on the same controls and fixed effects, greater cumulative liberalization is associated with a lower high-skilled share, which is consistent with the main positive Restrict coefficient when read from the easing side. Liberalizing events account for about 62 percent of retained policy events. This imbalance may contribute to the greater precision of the liberalizing estimate. The diagnostic identifies the side of the net score carrying the clearer association.</w:t>
       </w:r>
     </w:p>
     <w:p>
@@ -23653,7 +23656,7 @@
           <w:sz w:val="22"/>
           <w:szCs w:val="22"/>
         </w:rPr>
-        <w:t>Further work could model treaty-level breaks such as Brexit separately, incorporate time-varying bilateral factors such as migrant networks and migration costs, and examine whether the association differs across origins and particular policy tools. Estimating coefficients for origin-year conditions, including origin unemployment, would require a different identification structure because these variables are absorbed by the present origin-year fixed effects. Finally, future studies could connect permit composition to labor shortages, productivity, fiscal outcomes, integration, and migrant welfare. Together, these extensions would help determine whether the association documented here reflects migrant selection, administrative channel use, or broader labor-market adjustment.</w:t>
+        <w:t>Further work could examine heterogeneity across individual origin countries and origin characteristics beyond the income-group differences considered in this thesis. Estimating coefficients for origin-year conditions, including origin unemployment, would require a different identification structure because these variables are absorbed by the present origin-year fixed effects. Finally, future studies could connect permit composition to labor shortages, productivity, fiscal outcomes, integration, and migrant welfare. Together, these extensions would help determine whether the association documented here reflects migrant selection, administrative channel use, or broader labor-market adjustment.</w:t>
       </w:r>
     </w:p>
     <w:p>

</xml_diff>

<commit_message>
Clarify origin-year fixed-effect interpretation
</commit_message>
<xml_diff>
--- a/source/Toprak Thesis V23.docx
+++ b/source/Toprak Thesis V23.docx
@@ -131,10 +131,10 @@
       </w:r>
       <w:r>
         <w:br/>
-        <w:t>Word count: 14,99</w:t>
-      </w:r>
-      <w:r>
-        <w:t>2</w:t>
+        <w:t>Word count: 14,9</w:t>
+      </w:r>
+      <w:r>
+        <w:t>79</w:t>
       </w:r>
     </w:p>
     <w:p>
@@ -23049,11 +23049,11 @@
         <w:t>Multicollinearity diagnostic construction.</w:t>
       </w:r>
       <w:r>
-        <w:t xml:space="preserve"> The preferred model contains six substantive regressors: the cumulative all-migrant-worker, high-skilled, and low-skilled policy scores, lagged bilateral permit scale, lagged destination unemployment, and lagged destination GDP growth. A conventional variance inflation factor (VIF) that includes hundreds of fixed-effect indicators would mix intended fixed-effect absorption with collinearity among these regressors. The diagnostic therefore uses the exact preferred sample (N = 5,608) and the same current employment-permit-denominator weights. Each regressor is first residualized on destination and </w:t>
+        <w:t xml:space="preserve"> The preferred model contains six substantive regressors: the cumulative all-migrant-worker, high-skilled, and low-skilled policy scores, lagged bilateral permit scale, lagged destination unemployment, and lagged destination GDP growth. A conventional variance inflation factor (VIF) that includes hundreds of fixed-effect indicators would mix intended fixed-effect absorption with collinearity among these regressors. The diagnostic therefore uses the exact preferred sample (N = 5,608) and the same current employment-permit-denominator weights. Each regressor is first residualized on destination and origin-year fixed effects. Each weighted, residualized regressor is then regressed on the other </w:t>
       </w:r>
       <w:r>
         <w:lastRenderedPageBreak/>
-        <w:t>origin-year fixed effects. Each weighted, residualized regressor is then regressed on the other five, and its VIF is calculated as one divided by one minus the auxiliary R-squared. The normalized weighted residualized design is also used to calculate pairwise correlations and the condition index.</w:t>
+        <w:t>five, and its VIF is calculated as one divided by one minus the auxiliary R-squared. The normalized weighted residualized design is also used to calculate pairwise correlations and the condition index.</w:t>
       </w:r>
     </w:p>
     <w:p>
@@ -23656,7 +23656,7 @@
           <w:sz w:val="22"/>
           <w:szCs w:val="22"/>
         </w:rPr>
-        <w:t>Further work could examine heterogeneity across individual origin countries and origin characteristics beyond the income-group differences considered in this thesis. Estimating coefficients for origin-year conditions, including origin unemployment, would require a different identification structure because these variables are absorbed by the present origin-year fixed effects. Finally, future studies could connect permit composition to labor shortages, productivity, fiscal outcomes, integration, and migrant welfare. Together, these extensions would help determine whether the association documented here reflects migrant selection, administrative channel use, or broader labor-market adjustment.</w:t>
+        <w:t>Further work could examine heterogeneity across individual origin countries and origin characteristics beyond the income-group differences considered in this thesis. Origin-year fixed effects already absorb conditions shared by migrants from the same origin in a given year, including origin-country unemployment. Estimating a separate coefficient for origin unemployment would therefore require replacing the present origin-year fixed effects with a less restrictive structure, such as separate origin and year fixed effects. Finally, future studies could connect permit composition to labor shortages, productivity, fiscal outcomes, integration, and migrant welfare. Together, these extensions would help determine whether the association documented here reflects migrant selection, administrative channel use, or broader labor-market adjustment.</w:t>
       </w:r>
     </w:p>
     <w:p>

</xml_diff>